<commit_message>
Work some more on results section. added db-RDA and VPA results.
</commit_message>
<xml_diff>
--- a/Manuscript draft.docx
+++ b/Manuscript draft.docx
@@ -296,17 +296,10 @@
       <w:r>
         <w:t xml:space="preserve"> important fish populations whose early life stages are tightly coupled to seasonal oceanographic processes</w:t>
       </w:r>
-      <w:del w:id="4" w:author="Bobay, Luke Andrew" w:date="2026-08-28T07:41:00Z" w16du:dateUtc="2026-08-28T14:41:00Z">
-        <w:r>
-          <w:delText xml:space="preserve"> </w:delText>
-        </w:r>
-      </w:del>
-      <w:ins w:id="5" w:author="Bobay, Luke Andrew" w:date="2026-08-28T07:43:00Z" w16du:dateUtc="2026-08-28T14:43:00Z">
-        <w:r>
-          <w:t xml:space="preserve"> </w:t>
-        </w:r>
-      </w:ins>
-      <w:commentRangeStart w:id="6"/>
+      <w:r>
+        <w:t xml:space="preserve"> </w:t>
+      </w:r>
+      <w:commentRangeStart w:id="4"/>
       <w:r>
         <w:fldChar w:fldCharType="begin"/>
       </w:r>
@@ -322,14 +315,14 @@
       <w:r>
         <w:fldChar w:fldCharType="end"/>
       </w:r>
-      <w:commentRangeEnd w:id="6"/>
+      <w:commentRangeEnd w:id="4"/>
       <w:r>
         <w:rPr>
           <w:rStyle w:val="CommentReference"/>
           <w:sz w:val="24"/>
           <w:szCs w:val="24"/>
         </w:rPr>
-        <w:commentReference w:id="6"/>
+        <w:commentReference w:id="4"/>
       </w:r>
       <w:r>
         <w:t>. For many of these species</w:t>
@@ -337,16 +330,9 @@
       <w:r>
         <w:t>, peak spawning occurs in winter during which offshore transport is minimal</w:t>
       </w:r>
-      <w:del w:id="7" w:author="Bobay, Luke Andrew" w:date="2026-08-28T07:41:00Z" w16du:dateUtc="2026-08-28T14:41:00Z">
-        <w:r>
-          <w:delText xml:space="preserve"> </w:delText>
-        </w:r>
-      </w:del>
-      <w:ins w:id="8" w:author="Bobay, Luke Andrew" w:date="2026-08-28T07:43:00Z" w16du:dateUtc="2026-08-28T14:43:00Z">
-        <w:r>
-          <w:t xml:space="preserve"> </w:t>
-        </w:r>
-      </w:ins>
+      <w:r>
+        <w:t xml:space="preserve"> </w:t>
+      </w:r>
       <w:r>
         <w:fldChar w:fldCharType="begin"/>
       </w:r>
@@ -395,7 +381,7 @@
       <w:r>
         <w:fldChar w:fldCharType="end"/>
       </w:r>
-      <w:ins w:id="9" w:author="Bobay, Luke Andrew" w:date="2026-08-28T08:24:00Z" w16du:dateUtc="2026-08-28T15:24:00Z">
+      <w:ins w:id="5" w:author="Bobay, Luke Andrew" w:date="2026-08-28T08:24:00Z" w16du:dateUtc="2026-08-28T15:24:00Z">
         <w:r>
           <w:t>.</w:t>
         </w:r>
@@ -427,11 +413,9 @@
       <w:r>
         <w:t>favorable for ship-based sampling</w:t>
       </w:r>
-      <w:ins w:id="10" w:author="Bobay, Luke Andrew" w:date="2026-08-28T07:43:00Z" w16du:dateUtc="2026-08-28T14:43:00Z">
-        <w:r>
-          <w:t xml:space="preserve"> </w:t>
-        </w:r>
-      </w:ins>
+      <w:r>
+        <w:t xml:space="preserve"> </w:t>
+      </w:r>
       <w:r>
         <w:fldChar w:fldCharType="begin"/>
       </w:r>
@@ -447,18 +431,18 @@
       <w:r>
         <w:fldChar w:fldCharType="end"/>
       </w:r>
-      <w:commentRangeStart w:id="11"/>
+      <w:commentRangeStart w:id="6"/>
       <w:r>
         <w:t xml:space="preserve">. </w:t>
       </w:r>
-      <w:commentRangeEnd w:id="11"/>
+      <w:commentRangeEnd w:id="6"/>
       <w:r>
         <w:rPr>
           <w:rStyle w:val="CommentReference"/>
           <w:sz w:val="24"/>
           <w:szCs w:val="24"/>
         </w:rPr>
-        <w:commentReference w:id="11"/>
+        <w:commentReference w:id="6"/>
       </w:r>
       <w:r>
         <w:t>Further, while variation in ichthyoplankton assemblages is associated with oceanographic variability</w:t>
@@ -501,7 +485,7 @@
       </w:r>
     </w:p>
     <w:p>
-      <w:commentRangeStart w:id="12"/>
+      <w:commentRangeStart w:id="7"/>
       <w:r>
         <w:t xml:space="preserve">Broad oceanographic </w:t>
       </w:r>
@@ -520,9 +504,9 @@
       <w:r>
         <w:t xml:space="preserve"> </w:t>
       </w:r>
-      <w:commentRangeStart w:id="13"/>
-      <w:commentRangeStart w:id="14"/>
-      <w:commentRangeStart w:id="15"/>
+      <w:commentRangeStart w:id="8"/>
+      <w:commentRangeStart w:id="9"/>
+      <w:commentRangeStart w:id="10"/>
       <w:r>
         <w:t>circulation</w:t>
       </w:r>
@@ -538,41 +522,39 @@
       <w:r>
         <w:t xml:space="preserve">topography </w:t>
       </w:r>
-      <w:commentRangeEnd w:id="13"/>
+      <w:commentRangeEnd w:id="8"/>
       <w:r>
         <w:rPr>
           <w:rStyle w:val="CommentReference"/>
           <w:sz w:val="24"/>
           <w:szCs w:val="24"/>
         </w:rPr>
-        <w:commentReference w:id="13"/>
-      </w:r>
-      <w:commentRangeEnd w:id="14"/>
+        <w:commentReference w:id="8"/>
+      </w:r>
+      <w:commentRangeEnd w:id="9"/>
       <w:r>
         <w:rPr>
           <w:rStyle w:val="CommentReference"/>
           <w:sz w:val="24"/>
           <w:szCs w:val="24"/>
         </w:rPr>
-        <w:commentReference w:id="14"/>
-      </w:r>
-      <w:commentRangeEnd w:id="15"/>
+        <w:commentReference w:id="9"/>
+      </w:r>
+      <w:commentRangeEnd w:id="10"/>
       <w:r>
         <w:rPr>
           <w:rStyle w:val="CommentReference"/>
           <w:sz w:val="24"/>
           <w:szCs w:val="24"/>
         </w:rPr>
-        <w:commentReference w:id="15"/>
+        <w:commentReference w:id="10"/>
       </w:r>
       <w:r>
         <w:t>have been found to influence the composition, abundance, and distribution of larval fish</w:t>
       </w:r>
-      <w:ins w:id="16" w:author="Bobay, Luke Andrew" w:date="2026-08-28T09:47:00Z" w16du:dateUtc="2026-08-28T16:47:00Z">
-        <w:r>
-          <w:t xml:space="preserve"> </w:t>
-        </w:r>
-      </w:ins>
+      <w:r>
+        <w:t xml:space="preserve"> </w:t>
+      </w:r>
       <w:r>
         <w:fldChar w:fldCharType="begin"/>
       </w:r>
@@ -668,7 +650,13 @@
         <w:t>is related to primary</w:t>
       </w:r>
       <w:r>
-        <w:t xml:space="preserve"> productivity and </w:t>
+        <w:t xml:space="preserve"> productivity </w:t>
+      </w:r>
+      <w:r>
+        <w:t>which</w:t>
+      </w:r>
+      <w:r>
+        <w:t xml:space="preserve"> </w:t>
       </w:r>
       <w:r>
         <w:t>may indirectly indicate favorable prey availability</w:t>
@@ -734,7 +722,7 @@
         <w:t xml:space="preserve">. </w:t>
       </w:r>
       <w:r>
-        <w:t>Proximity to spawning habitat, as well as local currents, can therefore also influence horizontal structuring of ichthyoplankton assemblages</w:t>
+        <w:t>Proximity to spawning habitat, as well as local currents, can therefore influence horizontal structuring of ichthyoplankton assemblages</w:t>
       </w:r>
       <w:r>
         <w:t xml:space="preserve"> </w:t>
@@ -839,7 +827,13 @@
         <w:t xml:space="preserve">, </w:t>
       </w:r>
       <w:r>
-        <w:t>which may contribute to subdaily vertical variation in ichthyoplankton abundance and assemblage composition</w:t>
+        <w:t>which may contribute to sub</w:t>
+      </w:r>
+      <w:r>
+        <w:t>-</w:t>
+      </w:r>
+      <w:r>
+        <w:t>daily vertical variation in ichthyoplankton abundance and assemblage composition</w:t>
       </w:r>
       <w:r>
         <w:t xml:space="preserve">. Diel </w:t>
@@ -889,14 +883,14 @@
       <w:r>
         <w:t>.</w:t>
       </w:r>
-      <w:commentRangeEnd w:id="12"/>
+      <w:commentRangeEnd w:id="7"/>
       <w:r>
         <w:rPr>
           <w:rStyle w:val="CommentReference"/>
           <w:sz w:val="24"/>
           <w:szCs w:val="24"/>
         </w:rPr>
-        <w:commentReference w:id="12"/>
+        <w:commentReference w:id="7"/>
       </w:r>
       <w:r>
         <w:t xml:space="preserve"> </w:t>
@@ -931,28 +925,28 @@
       <w:r>
         <w:t xml:space="preserve"> is unknown</w:t>
       </w:r>
-      <w:commentRangeStart w:id="17"/>
-      <w:commentRangeStart w:id="18"/>
+      <w:commentRangeStart w:id="11"/>
+      <w:commentRangeStart w:id="12"/>
       <w:r>
         <w:t>.</w:t>
       </w:r>
-      <w:commentRangeEnd w:id="17"/>
+      <w:commentRangeEnd w:id="11"/>
       <w:r>
         <w:rPr>
           <w:rStyle w:val="CommentReference"/>
           <w:sz w:val="24"/>
           <w:szCs w:val="24"/>
         </w:rPr>
-        <w:commentReference w:id="17"/>
-      </w:r>
-      <w:commentRangeEnd w:id="18"/>
+        <w:commentReference w:id="11"/>
+      </w:r>
+      <w:commentRangeEnd w:id="12"/>
       <w:r>
         <w:rPr>
           <w:rStyle w:val="CommentReference"/>
           <w:sz w:val="24"/>
           <w:szCs w:val="24"/>
         </w:rPr>
-        <w:commentReference w:id="18"/>
+        <w:commentReference w:id="12"/>
       </w:r>
     </w:p>
     <w:p>
@@ -1368,68 +1362,217 @@
     </w:p>
     <w:p>
       <w:r>
-        <w:t>All data analyses were performed in RStudio</w:t>
-      </w:r>
-      <w:commentRangeStart w:id="19"/>
-      <w:commentRangeStart w:id="20"/>
-      <w:r>
-        <w:t xml:space="preserve">. </w:t>
-      </w:r>
-      <w:commentRangeEnd w:id="19"/>
+        <w:t xml:space="preserve"> </w:t>
+      </w:r>
+      <w:r>
+        <w:t>T</w:t>
+      </w:r>
+      <w:r>
+        <w:t xml:space="preserve">axonomic </w:t>
+      </w:r>
+      <w:r>
+        <w:t xml:space="preserve">identities </w:t>
+      </w:r>
+      <w:r>
+        <w:t>of</w:t>
+      </w:r>
+      <w:r>
+        <w:t xml:space="preserve"> larvae were </w:t>
+      </w:r>
+      <w:r>
+        <w:t>assessed for adult habitat affinit</w:t>
+      </w:r>
+      <w:r>
+        <w:t>y</w:t>
+      </w:r>
+      <w:r>
+        <w:t xml:space="preserve"> and </w:t>
+      </w:r>
+      <w:r>
+        <w:t xml:space="preserve">spawning habitat. Some taxa were then </w:t>
+      </w:r>
+      <w:r>
+        <w:t>aggregated</w:t>
+      </w:r>
+      <w:r>
+        <w:t xml:space="preserve"> into broader taxonomic </w:t>
+      </w:r>
+      <w:r>
+        <w:t>classifications</w:t>
+      </w:r>
+      <w:r>
+        <w:t xml:space="preserve">, </w:t>
+      </w:r>
+      <w:r>
+        <w:t xml:space="preserve">up to </w:t>
+      </w:r>
+      <w:r>
+        <w:t>family</w:t>
+      </w:r>
+      <w:r>
+        <w:t>-level</w:t>
+      </w:r>
+      <w:r>
+        <w:t>.</w:t>
+      </w:r>
+      <w:r>
+        <w:t xml:space="preserve"> This was done for taxa </w:t>
+      </w:r>
+      <w:r>
+        <w:t xml:space="preserve">that shared </w:t>
+      </w:r>
+      <w:r>
+        <w:t>habitat preferences</w:t>
+      </w:r>
+      <w:r>
+        <w:t xml:space="preserve"> </w:t>
+      </w:r>
+      <w:r>
+        <w:t>with</w:t>
+      </w:r>
+      <w:r>
+        <w:t xml:space="preserve"> </w:t>
+      </w:r>
+      <w:r>
+        <w:t>other</w:t>
+      </w:r>
+      <w:r>
+        <w:t xml:space="preserve"> taxa</w:t>
+      </w:r>
+      <w:r>
+        <w:t xml:space="preserve"> in </w:t>
+      </w:r>
+      <w:r>
+        <w:t>their</w:t>
+      </w:r>
+      <w:r>
+        <w:t xml:space="preserve"> </w:t>
+      </w:r>
+      <w:r>
+        <w:t>group</w:t>
+      </w:r>
+      <w:r>
+        <w:t xml:space="preserve">. When such </w:t>
+      </w:r>
+      <w:r>
+        <w:lastRenderedPageBreak/>
+        <w:t>characteristics were not shared</w:t>
+      </w:r>
+      <w:r>
+        <w:t xml:space="preserve">, finer taxonomic </w:t>
+      </w:r>
+      <w:r>
+        <w:t>identities</w:t>
+      </w:r>
+      <w:r>
+        <w:t xml:space="preserve"> were preserved</w:t>
+      </w:r>
+      <w:r>
+        <w:t xml:space="preserve"> to maintain </w:t>
+      </w:r>
+      <w:r>
+        <w:t xml:space="preserve">potentially significant ecological differences. </w:t>
+      </w:r>
+      <w:r>
+        <w:t xml:space="preserve">Additionally, when </w:t>
+      </w:r>
+      <w:r>
+        <w:t xml:space="preserve">only a single species or genus was identified from a family, said </w:t>
+      </w:r>
+      <w:r>
+        <w:t>lowest-resolution identity</w:t>
+      </w:r>
+      <w:r>
+        <w:t xml:space="preserve"> was preserved. </w:t>
+      </w:r>
+      <w:r>
+        <w:t xml:space="preserve">To further reduce noise in the data, </w:t>
+      </w:r>
+      <w:r>
+        <w:t xml:space="preserve">we </w:t>
+      </w:r>
+      <w:r>
+        <w:t xml:space="preserve">removed taxonomic classes with fewer than </w:t>
+      </w:r>
+      <w:commentRangeStart w:id="13"/>
+      <w:r>
+        <w:t xml:space="preserve">10 </w:t>
+      </w:r>
+      <w:commentRangeEnd w:id="13"/>
       <w:r>
         <w:rPr>
           <w:rStyle w:val="CommentReference"/>
           <w:sz w:val="24"/>
           <w:szCs w:val="24"/>
         </w:rPr>
-        <w:commentReference w:id="19"/>
-      </w:r>
-      <w:commentRangeEnd w:id="20"/>
+        <w:commentReference w:id="13"/>
+      </w:r>
+      <w:r>
+        <w:t xml:space="preserve">overall </w:t>
+      </w:r>
+      <w:r>
+        <w:t xml:space="preserve">occurrences </w:t>
+      </w:r>
+      <w:r>
+        <w:t xml:space="preserve">and net tows with fewer than </w:t>
+      </w:r>
+      <w:r>
+        <w:t xml:space="preserve">10 total individuals. </w:t>
+      </w:r>
+    </w:p>
+    <w:p>
+      <w:r>
+        <w:t>All data analyses were performed in RStudio</w:t>
+      </w:r>
+      <w:r>
+        <w:t xml:space="preserve"> </w:t>
+      </w:r>
+      <w:r>
+        <w:t>(v4.3.1; R Core Team</w:t>
+      </w:r>
+      <w:r>
+        <w:t>, 2023)</w:t>
+      </w:r>
+      <w:commentRangeStart w:id="14"/>
+      <w:commentRangeStart w:id="15"/>
+      <w:r>
+        <w:t xml:space="preserve">. </w:t>
+      </w:r>
+      <w:commentRangeEnd w:id="14"/>
       <w:r>
         <w:rPr>
           <w:rStyle w:val="CommentReference"/>
           <w:sz w:val="24"/>
           <w:szCs w:val="24"/>
         </w:rPr>
-        <w:commentReference w:id="20"/>
-      </w:r>
-      <w:r>
-        <w:t xml:space="preserve">To identify </w:t>
-      </w:r>
-      <w:r>
-        <w:t xml:space="preserve">ecologically distinct </w:t>
-      </w:r>
-      <w:r>
-        <w:t>larval fish assemblages,</w:t>
-      </w:r>
-      <w:r>
-        <w:t xml:space="preserve"> </w:t>
-      </w:r>
-      <w:r>
-        <w:t xml:space="preserve">first </w:t>
-      </w:r>
-      <w:r>
-        <w:t xml:space="preserve">the density of each taxonomic group within each net tow was </w:t>
-      </w:r>
-      <w:commentRangeStart w:id="21"/>
-      <w:r>
-        <w:t>square-root transformed</w:t>
-      </w:r>
-      <w:commentRangeEnd w:id="21"/>
+        <w:commentReference w:id="14"/>
+      </w:r>
+      <w:commentRangeEnd w:id="15"/>
       <w:r>
         <w:rPr>
           <w:rStyle w:val="CommentReference"/>
           <w:sz w:val="24"/>
           <w:szCs w:val="24"/>
         </w:rPr>
-        <w:commentReference w:id="21"/>
-      </w:r>
-      <w:r>
-        <w:t xml:space="preserve">. These were then used to generate a matrix of Bray-Curtis dissimilarities between </w:t>
-      </w:r>
-      <w:r>
-        <w:lastRenderedPageBreak/>
-        <w:t>net tows. Agglomerative hierarchal clustering was performed on th</w:t>
+        <w:commentReference w:id="15"/>
+      </w:r>
+      <w:r>
+        <w:t xml:space="preserve">To identify </w:t>
+      </w:r>
+      <w:r>
+        <w:t xml:space="preserve">ecologically distinct </w:t>
+      </w:r>
+      <w:r>
+        <w:t>larval fish assemblages,</w:t>
+      </w:r>
+      <w:r>
+        <w:t xml:space="preserve"> </w:t>
+      </w:r>
+      <w:r>
+        <w:t xml:space="preserve">first </w:t>
+      </w:r>
+      <w:r>
+        <w:t>the density of each taxonomic group within each net tow was square-root transformed. These were then used to generate a matrix of Bray-Curtis dissimilarities between net tows. Agglomerative hierarchal clustering was performed on th</w:t>
       </w:r>
       <w:r>
         <w:t xml:space="preserve">e dissimilarity matrix </w:t>
@@ -1590,6 +1733,21 @@
       </w:r>
       <w:r>
         <w:t xml:space="preserve"> </w:t>
+      </w:r>
+    </w:p>
+    <w:p>
+      <w:r>
+        <w:t>[</w:t>
+      </w:r>
+      <w:r>
+        <w:rPr>
+          <w:b/>
+          <w:bCs/>
+        </w:rPr>
+        <w:t>Add paragraph(s) here describing db-RDA and VPA methods?</w:t>
+      </w:r>
+      <w:r>
+        <w:t>]</w:t>
       </w:r>
     </w:p>
     <w:p>
@@ -2942,7 +3100,7 @@
       <w:r>
         <w:t>each sample.</w:t>
       </w:r>
-      <w:ins w:id="22" w:author="Bobay, Luke Andrew" w:date="2026-08-29T00:39:00Z" w16du:dateUtc="2026-08-29T07:39:00Z">
+      <w:ins w:id="16" w:author="Bobay, Luke Andrew" w:date="2026-08-29T00:39:00Z" w16du:dateUtc="2026-08-29T07:39:00Z">
         <w:r>
           <w:t xml:space="preserve"> </w:t>
         </w:r>
@@ -2950,6 +3108,7 @@
     </w:p>
     <w:p>
       <w:r>
+        <w:lastRenderedPageBreak/>
         <w:t>The model parameters associated with these effects do not directly address whether each taxon undergoes DVM. To visualize how the vertical distribution of each taxon varies over the course of a day, we plotted the predicted concentration of individuals belonging to each taxon across combinations of depth and time of day</w:t>
       </w:r>
       <w:r>
@@ -3021,7 +3180,6 @@
         <w:pStyle w:val="Heading2"/>
       </w:pPr>
       <w:r>
-        <w:lastRenderedPageBreak/>
         <w:t>3.1</w:t>
       </w:r>
       <w:r>
@@ -3045,7 +3203,13 @@
         </w:rPr>
       </w:pPr>
       <w:r>
-        <w:t xml:space="preserve">Cluster analysis of net tows yielded seven total clusters, two of which—clusters 4 and 7—contained only a single sampling tow (Supplementary Material Fig. 1). The composition of clusters was assessed statistically and visually, concentrating on the other five clusters that consisted of multiple samples. Cluster 1 was present in all four sampling years and was heavily dominated by its indicator taxa, </w:t>
+        <w:t xml:space="preserve">Cluster analysis of net tows yielded seven total clusters, two of which—clusters 4 and 7—contained only a single sampling tow (Supplementary Material Fig. 1). </w:t>
+      </w:r>
+      <w:r>
+        <w:t xml:space="preserve">All subsequent analyses were concentrated </w:t>
+      </w:r>
+      <w:r>
+        <w:t xml:space="preserve">on the other five clusters that consisted of multiple samples. Cluster 1 was present in all four sampling years and was heavily dominated by its indicator taxa, </w:t>
       </w:r>
       <w:r>
         <w:rPr>
@@ -3055,47 +3219,103 @@
         <w:t>Sebastes</w:t>
       </w:r>
       <w:r>
-        <w:t xml:space="preserve"> spp. (Fig. 2 and Table 1). Though also present in all years, clusters 2 and 3 had the greatest visual prevalence of their indicator taxa during 2019 (Fig. 2B). Cluster 2 was dominantly composed of pleuronectiformes, particularly the indicator species </w:t>
-      </w:r>
+        <w:t xml:space="preserve"> spp. (Fig. 2 and Table 1). Though also present in all years, clusters 2 and 3 had the greatest visual prevalence of their indicator taxa during 2019 (Fig. 2B). Cluster 2 was dominantly composed of pleuronectiformes, </w:t>
+      </w:r>
+      <w:r>
+        <w:t>especially</w:t>
+      </w:r>
+      <w:r>
+        <w:t xml:space="preserve"> the indicator species </w:t>
+      </w:r>
+      <w:commentRangeStart w:id="17"/>
+      <w:commentRangeStart w:id="18"/>
       <w:r>
         <w:rPr>
           <w:i/>
           <w:iCs/>
         </w:rPr>
-        <w:t>P. vetulus</w:t>
-      </w:r>
-      <w:r>
-        <w:t xml:space="preserve"> (Fig. 2A and Table 1). Cluster 3 was significantly indicated by </w:t>
+        <w:t>Parophrys</w:t>
       </w:r>
       <w:r>
         <w:rPr>
           <w:i/>
           <w:iCs/>
         </w:rPr>
-        <w:t>S. leucopsarus</w:t>
-      </w:r>
-      <w:r>
-        <w:t xml:space="preserve"> (Table 1) and visually dominated by mesopelagic species, particularly Myctophids (Fig. 2A). Cluster 5 was composed predominantly of samples from 2022 and was visually split between </w:t>
+        <w:t xml:space="preserve"> </w:t>
       </w:r>
       <w:r>
         <w:rPr>
           <w:i/>
           <w:iCs/>
         </w:rPr>
-        <w:t>P. vetulus</w:t>
-      </w:r>
-      <w:r>
-        <w:t xml:space="preserve"> and </w:t>
+        <w:t>vetulus</w:t>
+      </w:r>
+      <w:r>
+        <w:t xml:space="preserve"> </w:t>
+      </w:r>
+      <w:commentRangeEnd w:id="17"/>
+      <w:r>
+        <w:rPr>
+          <w:rStyle w:val="CommentReference"/>
+          <w:sz w:val="24"/>
+          <w:szCs w:val="24"/>
+        </w:rPr>
+        <w:commentReference w:id="17"/>
+      </w:r>
+      <w:commentRangeEnd w:id="18"/>
+      <w:r>
+        <w:rPr>
+          <w:rStyle w:val="CommentReference"/>
+          <w:sz w:val="24"/>
+          <w:szCs w:val="24"/>
+        </w:rPr>
+        <w:commentReference w:id="18"/>
+      </w:r>
+      <w:r>
+        <w:t xml:space="preserve">(Fig. 2A and Table 1). Cluster 3 was significantly indicated by </w:t>
       </w:r>
       <w:r>
         <w:rPr>
           <w:i/>
           <w:iCs/>
         </w:rPr>
+        <w:t>Stenobrachius</w:t>
+      </w:r>
+      <w:r>
+        <w:rPr>
+          <w:i/>
+          <w:iCs/>
+        </w:rPr>
+        <w:t xml:space="preserve"> leucopsarus</w:t>
+      </w:r>
+      <w:r>
+        <w:t xml:space="preserve"> (Table 1) and visually dominated by mesopelagic species, particularly Myctophids (Fig. 2A). Cluster 5 was composed predominantly of samples from 2022 and was visually split between </w:t>
+      </w:r>
+      <w:r>
+        <w:rPr>
+          <w:i/>
+          <w:iCs/>
+        </w:rPr>
+        <w:t>P. vetulus</w:t>
+      </w:r>
+      <w:r>
+        <w:t xml:space="preserve"> and </w:t>
+      </w:r>
+      <w:r>
+        <w:rPr>
+          <w:i/>
+          <w:iCs/>
+        </w:rPr>
         <w:t>Liparis</w:t>
       </w:r>
       <w:r>
-        <w:t xml:space="preserve"> spp. (Fig. 2). This is indicative of a general nearshore community, further supported by the ISA (Table 1). Cluster 6 was present in 2022 and 2023 and was visually dominated by coastal taxa, especially Osmerid</w:t>
+        <w:t xml:space="preserve"> spp. (Fig. 2). This is indicative of a general nearshore </w:t>
+      </w:r>
+      <w:r>
+        <w:t>assemblage</w:t>
+      </w:r>
+      <w:r>
+        <w:t>, further supported by the ISA (Table 1). Cluster 6 was present in 2022 and 2023 and was visually dominated by coastal taxa, especially Osmerid</w:t>
       </w:r>
       <w:r>
         <w:t xml:space="preserve">ae </w:t>
@@ -3138,7 +3358,29 @@
         <w:t>P. vetulus</w:t>
       </w:r>
       <w:r>
-        <w:t xml:space="preserve"> community (cluster 2) was present almost exclusively on the shelf during all years without a distinct depth preference (Fig. 3). Cluster 3, the Myctophid community, was most apparent offshore and in tows at greater depths (Fig. 3). The assemblage of nearshore taxa was most prevalent in 2022 and occurred mostly nearshore, though depth varied (Fig. 3). Cluster 6, the community of Osmeridae and other coastal taxa, was found almost exclusively at the most nearshore stations and shallowest depths (Fig. 3). </w:t>
+        <w:t xml:space="preserve"> </w:t>
+      </w:r>
+      <w:r>
+        <w:t>assemblage</w:t>
+      </w:r>
+      <w:r>
+        <w:t xml:space="preserve"> (cluster 2) was present almost exclusively on the shelf during all years without a distinct depth preference (Fig. 3). Cluster 3, the Myctophid </w:t>
+      </w:r>
+      <w:r>
+        <w:t>assemblage</w:t>
+      </w:r>
+      <w:r>
+        <w:t xml:space="preserve">, was most apparent offshore and in tows at greater depths (Fig. 3). The assemblage of nearshore taxa was most prevalent in 2022 and occurred </w:t>
+      </w:r>
+      <w:r>
+        <w:lastRenderedPageBreak/>
+        <w:t xml:space="preserve">mostly nearshore, though depth varied (Fig. 3). Cluster 6, the </w:t>
+      </w:r>
+      <w:r>
+        <w:t>assemblage</w:t>
+      </w:r>
+      <w:r>
+        <w:t xml:space="preserve"> of Osmeridae and other coastal taxa, was found almost exclusively at the most nearshore stations and shallowest depths (Fig. 3). </w:t>
       </w:r>
     </w:p>
     <w:p>
@@ -3174,19 +3416,115 @@
           <w:bCs w:val="0"/>
           <w:color w:val="auto"/>
         </w:rPr>
-        <w:t xml:space="preserve">The </w:t>
-      </w:r>
-      <w:commentRangeStart w:id="23"/>
-      <w:r>
-        <w:rPr>
-          <w:rFonts w:eastAsiaTheme="minorHAnsi"/>
-          <w:b w:val="0"/>
-          <w:bCs w:val="0"/>
-          <w:color w:val="auto"/>
-        </w:rPr>
-        <w:t xml:space="preserve">NMDS </w:t>
-      </w:r>
-      <w:commentRangeEnd w:id="23"/>
+        <w:t xml:space="preserve">The NMDS was plotted to visualize unconstrained variation in the community structure in ordination space. Net tows were colored by cluster assignment to compare how clusters correlate to one another. For instance, there appears to be possible correlations between clusters 2 and 6 and clusters 1 and 3 (Fig. 4). Additionally, the relation of the clusters to spatiotemporal variables was visualized with vector overlays on the NMDS ordination plot. From this, it appears that the </w:t>
+      </w:r>
+      <w:r>
+        <w:rPr>
+          <w:rFonts w:eastAsiaTheme="minorHAnsi"/>
+          <w:b w:val="0"/>
+          <w:bCs w:val="0"/>
+          <w:i/>
+          <w:iCs/>
+          <w:color w:val="auto"/>
+        </w:rPr>
+        <w:t>P. vetulus</w:t>
+      </w:r>
+      <w:r>
+        <w:rPr>
+          <w:rFonts w:eastAsiaTheme="minorHAnsi"/>
+          <w:b w:val="0"/>
+          <w:bCs w:val="0"/>
+          <w:color w:val="auto"/>
+        </w:rPr>
+        <w:t xml:space="preserve"> (cluster 2) and coastal (cluster 6) assemblages both correlated negatively with sea floor depth (m) (Fig. 4). Similarly, the </w:t>
+      </w:r>
+      <w:r>
+        <w:rPr>
+          <w:rFonts w:eastAsiaTheme="minorHAnsi"/>
+          <w:b w:val="0"/>
+          <w:bCs w:val="0"/>
+          <w:i/>
+          <w:iCs/>
+          <w:color w:val="auto"/>
+        </w:rPr>
+        <w:t>Sebastes</w:t>
+      </w:r>
+      <w:r>
+        <w:rPr>
+          <w:rFonts w:eastAsiaTheme="minorHAnsi"/>
+          <w:b w:val="0"/>
+          <w:bCs w:val="0"/>
+          <w:color w:val="auto"/>
+        </w:rPr>
+        <w:t xml:space="preserve"> spp. (cluster 1) and Myctophid (cluster 3) </w:t>
+      </w:r>
+      <w:r>
+        <w:rPr>
+          <w:rFonts w:eastAsiaTheme="minorHAnsi"/>
+          <w:b w:val="0"/>
+          <w:bCs w:val="0"/>
+          <w:color w:val="auto"/>
+        </w:rPr>
+        <w:t>assemblages</w:t>
+      </w:r>
+      <w:r>
+        <w:rPr>
+          <w:rFonts w:eastAsiaTheme="minorHAnsi"/>
+          <w:b w:val="0"/>
+          <w:bCs w:val="0"/>
+          <w:color w:val="auto"/>
+        </w:rPr>
+        <w:t xml:space="preserve"> appeared to correlate negatively with mean sampling depth (m) (Fig. 4). Cluster 3, as well as cluster 5, appeared to correlate negatively with latitude (Fig. 4). The nearshore </w:t>
+      </w:r>
+      <w:r>
+        <w:rPr>
+          <w:rFonts w:eastAsiaTheme="minorHAnsi"/>
+          <w:b w:val="0"/>
+          <w:bCs w:val="0"/>
+          <w:color w:val="auto"/>
+        </w:rPr>
+        <w:t>assemblage</w:t>
+      </w:r>
+      <w:r>
+        <w:rPr>
+          <w:rFonts w:eastAsiaTheme="minorHAnsi"/>
+          <w:b w:val="0"/>
+          <w:bCs w:val="0"/>
+          <w:color w:val="auto"/>
+        </w:rPr>
+        <w:t xml:space="preserve"> (cluster 5) additionally was correlated somewhat with the variable “daytime” (Fig. 4). </w:t>
+      </w:r>
+    </w:p>
+    <w:p>
+      <w:pPr>
+        <w:pStyle w:val="Heading2"/>
+        <w:rPr>
+          <w:rFonts w:eastAsiaTheme="minorHAnsi"/>
+          <w:b w:val="0"/>
+          <w:bCs w:val="0"/>
+          <w:color w:val="auto"/>
+        </w:rPr>
+      </w:pPr>
+      <w:r>
+        <w:rPr>
+          <w:rFonts w:eastAsiaTheme="minorHAnsi"/>
+          <w:b w:val="0"/>
+          <w:bCs w:val="0"/>
+          <w:color w:val="auto"/>
+        </w:rPr>
+        <w:t xml:space="preserve">To assess the fit of the NMDS ordination to the data, stress was measured. The stress statistic resulting from the NMDS, </w:t>
+      </w:r>
+      <w:commentRangeStart w:id="19"/>
+      <w:r>
+        <w:rPr>
+          <w:rFonts w:eastAsiaTheme="minorHAnsi"/>
+          <w:b w:val="0"/>
+          <w:bCs w:val="0"/>
+          <w:color w:val="auto"/>
+        </w:rPr>
+        <w:t>0.2006</w:t>
+      </w:r>
+      <w:commentRangeEnd w:id="19"/>
       <w:r>
         <w:rPr>
           <w:rStyle w:val="CommentReference"/>
@@ -3197,16 +3535,458 @@
           <w:sz w:val="24"/>
           <w:szCs w:val="24"/>
         </w:rPr>
-        <w:commentReference w:id="23"/>
-      </w:r>
-      <w:r>
-        <w:rPr>
-          <w:rFonts w:eastAsiaTheme="minorHAnsi"/>
-          <w:b w:val="0"/>
-          <w:bCs w:val="0"/>
-          <w:color w:val="auto"/>
-        </w:rPr>
-        <w:t xml:space="preserve">was plotted to visualize unconstrained variation in the community structure in ordination space. Net tows were colored by cluster assignment to compare how clusters correlate to one another. For instance, there appears to be possible correlations between clusters 2 and 6 and clusters 1 and 3 (Fig. 4). Additionally, the relation of the clusters to spatiotemporal variables was visualized with vector overlays on the NMDS ordination plot. From this, it appears that the </w:t>
+        <w:commentReference w:id="19"/>
+      </w:r>
+      <w:r>
+        <w:rPr>
+          <w:rFonts w:eastAsiaTheme="minorHAnsi"/>
+          <w:b w:val="0"/>
+          <w:bCs w:val="0"/>
+          <w:color w:val="auto"/>
+        </w:rPr>
+        <w:t xml:space="preserve">, would generally be considered indicative of a poor fit to the data (stress &gt; 0.2). However, in the same paper that first proposed this common interpretation, Clarke (1993) warned against using his guideline as a hard cutoff and </w:t>
+      </w:r>
+      <w:r>
+        <w:rPr>
+          <w:rFonts w:eastAsiaTheme="minorHAnsi"/>
+          <w:b w:val="0"/>
+          <w:bCs w:val="0"/>
+          <w:color w:val="auto"/>
+        </w:rPr>
+        <w:t>over relying</w:t>
+      </w:r>
+      <w:r>
+        <w:rPr>
+          <w:rFonts w:eastAsiaTheme="minorHAnsi"/>
+          <w:b w:val="0"/>
+          <w:bCs w:val="0"/>
+          <w:color w:val="auto"/>
+        </w:rPr>
+        <w:t xml:space="preserve"> on stress for evaluating ordination fit. Because the stress value was close to the 0.2 ceiling and our data may have been susceptible to the general tendency of large datasets to yield greater stress values, we further investigated NMDS stress with an iterative permutation model developed by Dexter et al. (2018). In this, we assessed the null hypothesis that the community was not systematically structured with a one sample z-test. Our result supported rejection of this null hypothesis (</w:t>
+      </w:r>
+      <w:commentRangeStart w:id="20"/>
+      <w:r>
+        <w:rPr>
+          <w:rFonts w:eastAsiaTheme="minorHAnsi"/>
+          <w:b w:val="0"/>
+          <w:bCs w:val="0"/>
+          <w:color w:val="auto"/>
+        </w:rPr>
+        <w:t>p =  4.5222 10-96</w:t>
+      </w:r>
+      <w:commentRangeEnd w:id="20"/>
+      <w:r>
+        <w:rPr>
+          <w:rStyle w:val="CommentReference"/>
+          <w:rFonts w:eastAsiaTheme="minorHAnsi"/>
+          <w:b w:val="0"/>
+          <w:bCs w:val="0"/>
+          <w:color w:val="auto"/>
+          <w:sz w:val="24"/>
+          <w:szCs w:val="24"/>
+        </w:rPr>
+        <w:commentReference w:id="20"/>
+      </w:r>
+      <w:r>
+        <w:rPr>
+          <w:rFonts w:eastAsiaTheme="minorHAnsi"/>
+          <w:b w:val="0"/>
+          <w:bCs w:val="0"/>
+          <w:color w:val="auto"/>
+        </w:rPr>
+        <w:t>) and justified use of the ordination for biological interpretation.</w:t>
+      </w:r>
+    </w:p>
+    <w:p>
+      <w:pPr>
+        <w:pStyle w:val="Heading2"/>
+        <w:rPr>
+          <w:rFonts w:eastAsiaTheme="minorHAnsi"/>
+          <w:b w:val="0"/>
+          <w:bCs w:val="0"/>
+          <w:color w:val="auto"/>
+        </w:rPr>
+      </w:pPr>
+      <w:r>
+        <w:rPr>
+          <w:rFonts w:eastAsiaTheme="minorHAnsi"/>
+          <w:b w:val="0"/>
+          <w:bCs w:val="0"/>
+          <w:color w:val="auto"/>
+        </w:rPr>
+        <w:t>Distance-based redundancy analysis (db-RDA) and variance partitioning analysis (VPA) were run on the data to more clearly investigate the effects of variables on the LFC. A model with only spatiotemporal variables and a model with spatiotemporal and environmental variables were both found to explain a significant amount of variance in the community (p-values &lt; 0.05). Comparison of these models found a significant increase in explanatory power with the introduction of environmental variables to the spatiotemporal-only model (</w:t>
+      </w:r>
+      <w:commentRangeStart w:id="21"/>
+      <w:r>
+        <w:rPr>
+          <w:rFonts w:eastAsiaTheme="minorHAnsi"/>
+          <w:b w:val="0"/>
+          <w:bCs w:val="0"/>
+          <w:color w:val="auto"/>
+        </w:rPr>
+        <w:t>p = …</w:t>
+      </w:r>
+      <w:commentRangeEnd w:id="21"/>
+      <w:r>
+        <w:rPr>
+          <w:rStyle w:val="CommentReference"/>
+          <w:rFonts w:eastAsiaTheme="minorHAnsi"/>
+          <w:b w:val="0"/>
+          <w:bCs w:val="0"/>
+          <w:color w:val="auto"/>
+          <w:sz w:val="24"/>
+          <w:szCs w:val="24"/>
+        </w:rPr>
+        <w:commentReference w:id="21"/>
+      </w:r>
+      <w:r>
+        <w:rPr>
+          <w:rFonts w:eastAsiaTheme="minorHAnsi"/>
+          <w:b w:val="0"/>
+          <w:bCs w:val="0"/>
+          <w:color w:val="auto"/>
+        </w:rPr>
+        <w:t xml:space="preserve">). VPA indicated that about </w:t>
+      </w:r>
+      <w:commentRangeStart w:id="22"/>
+      <w:r>
+        <w:rPr>
+          <w:rFonts w:eastAsiaTheme="minorHAnsi"/>
+          <w:b w:val="0"/>
+          <w:bCs w:val="0"/>
+          <w:color w:val="auto"/>
+        </w:rPr>
+        <w:t>3.</w:t>
+      </w:r>
+      <w:r>
+        <w:rPr>
+          <w:rFonts w:eastAsiaTheme="minorHAnsi"/>
+          <w:b w:val="0"/>
+          <w:bCs w:val="0"/>
+          <w:color w:val="auto"/>
+        </w:rPr>
+        <w:t>72</w:t>
+      </w:r>
+      <w:r>
+        <w:rPr>
+          <w:rFonts w:eastAsiaTheme="minorHAnsi"/>
+          <w:b w:val="0"/>
+          <w:bCs w:val="0"/>
+          <w:color w:val="auto"/>
+        </w:rPr>
+        <w:t>% of variance was explained by spatiotemporal variables alone</w:t>
+      </w:r>
+      <w:r>
+        <w:rPr>
+          <w:rFonts w:eastAsiaTheme="minorHAnsi"/>
+          <w:b w:val="0"/>
+          <w:bCs w:val="0"/>
+          <w:color w:val="auto"/>
+        </w:rPr>
+        <w:t xml:space="preserve">, </w:t>
+      </w:r>
+      <w:r>
+        <w:rPr>
+          <w:rFonts w:eastAsiaTheme="minorHAnsi"/>
+          <w:b w:val="0"/>
+          <w:bCs w:val="0"/>
+          <w:color w:val="auto"/>
+        </w:rPr>
+        <w:t xml:space="preserve">1.92% was explained by environmental </w:t>
+      </w:r>
+      <w:r>
+        <w:rPr>
+          <w:rFonts w:eastAsiaTheme="minorHAnsi"/>
+          <w:b w:val="0"/>
+          <w:bCs w:val="0"/>
+          <w:color w:val="auto"/>
+        </w:rPr>
+        <w:t>variables alone, and together all the variables explained 1.57%</w:t>
+      </w:r>
+      <w:commentRangeEnd w:id="22"/>
+      <w:r>
+        <w:rPr>
+          <w:rStyle w:val="CommentReference"/>
+          <w:rFonts w:eastAsiaTheme="minorHAnsi"/>
+          <w:b w:val="0"/>
+          <w:bCs w:val="0"/>
+          <w:color w:val="auto"/>
+          <w:sz w:val="24"/>
+          <w:szCs w:val="24"/>
+        </w:rPr>
+        <w:commentReference w:id="22"/>
+      </w:r>
+      <w:r>
+        <w:rPr>
+          <w:rFonts w:eastAsiaTheme="minorHAnsi"/>
+          <w:b w:val="0"/>
+          <w:bCs w:val="0"/>
+          <w:color w:val="auto"/>
+        </w:rPr>
+        <w:t xml:space="preserve">I  of variance. </w:t>
+      </w:r>
+    </w:p>
+    <w:p>
+      <w:pPr>
+        <w:pStyle w:val="Heading2"/>
+        <w:rPr>
+          <w:rFonts w:eastAsiaTheme="minorHAnsi"/>
+          <w:b w:val="0"/>
+          <w:bCs w:val="0"/>
+          <w:color w:val="auto"/>
+        </w:rPr>
+      </w:pPr>
+      <w:r>
+        <w:rPr>
+          <w:rFonts w:eastAsiaTheme="minorHAnsi"/>
+          <w:b w:val="0"/>
+          <w:bCs w:val="0"/>
+          <w:color w:val="auto"/>
+        </w:rPr>
+        <w:t xml:space="preserve">The db-RDA identified </w:t>
+      </w:r>
+      <w:r>
+        <w:rPr>
+          <w:rFonts w:eastAsiaTheme="minorHAnsi"/>
+          <w:b w:val="0"/>
+          <w:bCs w:val="0"/>
+          <w:color w:val="auto"/>
+        </w:rPr>
+        <w:t xml:space="preserve">that all covariates had </w:t>
+      </w:r>
+      <w:r>
+        <w:rPr>
+          <w:rFonts w:eastAsiaTheme="minorHAnsi"/>
+          <w:b w:val="0"/>
+          <w:bCs w:val="0"/>
+          <w:color w:val="auto"/>
+        </w:rPr>
+        <w:t xml:space="preserve">statistically </w:t>
+      </w:r>
+      <w:r>
+        <w:rPr>
+          <w:rFonts w:eastAsiaTheme="minorHAnsi"/>
+          <w:b w:val="0"/>
+          <w:bCs w:val="0"/>
+          <w:color w:val="auto"/>
+        </w:rPr>
+        <w:t xml:space="preserve">significant effects on the model, to varied degrees. </w:t>
+      </w:r>
+      <w:r>
+        <w:rPr>
+          <w:rFonts w:eastAsiaTheme="minorHAnsi"/>
+          <w:b w:val="0"/>
+          <w:bCs w:val="0"/>
+          <w:color w:val="auto"/>
+        </w:rPr>
+        <w:t>A plot</w:t>
+      </w:r>
+      <w:r>
+        <w:rPr>
+          <w:rFonts w:eastAsiaTheme="minorHAnsi"/>
+          <w:b w:val="0"/>
+          <w:bCs w:val="0"/>
+          <w:color w:val="auto"/>
+        </w:rPr>
+        <w:t xml:space="preserve"> of the db-RDA</w:t>
+      </w:r>
+      <w:r>
+        <w:rPr>
+          <w:rFonts w:eastAsiaTheme="minorHAnsi"/>
+          <w:b w:val="0"/>
+          <w:bCs w:val="0"/>
+          <w:color w:val="auto"/>
+        </w:rPr>
+        <w:t xml:space="preserve"> </w:t>
+      </w:r>
+      <w:r>
+        <w:rPr>
+          <w:rFonts w:eastAsiaTheme="minorHAnsi"/>
+          <w:b w:val="0"/>
+          <w:bCs w:val="0"/>
+          <w:color w:val="auto"/>
+        </w:rPr>
+        <w:t xml:space="preserve">visually represented the clustered net tows and </w:t>
+      </w:r>
+      <w:r>
+        <w:rPr>
+          <w:rFonts w:eastAsiaTheme="minorHAnsi"/>
+          <w:b w:val="0"/>
+          <w:bCs w:val="0"/>
+          <w:color w:val="auto"/>
+        </w:rPr>
+        <w:t>covariates</w:t>
+      </w:r>
+      <w:r>
+        <w:rPr>
+          <w:rFonts w:eastAsiaTheme="minorHAnsi"/>
+          <w:b w:val="0"/>
+          <w:bCs w:val="0"/>
+          <w:color w:val="auto"/>
+        </w:rPr>
+        <w:t xml:space="preserve"> </w:t>
+      </w:r>
+      <w:r>
+        <w:rPr>
+          <w:rFonts w:eastAsiaTheme="minorHAnsi"/>
+          <w:b w:val="0"/>
+          <w:bCs w:val="0"/>
+          <w:color w:val="auto"/>
+        </w:rPr>
+        <w:t>in constrained ordination space</w:t>
+      </w:r>
+      <w:r>
+        <w:rPr>
+          <w:rFonts w:eastAsiaTheme="minorHAnsi"/>
+          <w:b w:val="0"/>
+          <w:bCs w:val="0"/>
+          <w:color w:val="auto"/>
+        </w:rPr>
+        <w:t xml:space="preserve"> (Fig. </w:t>
+      </w:r>
+      <w:r>
+        <w:rPr>
+          <w:rFonts w:eastAsiaTheme="minorHAnsi"/>
+          <w:b w:val="0"/>
+          <w:bCs w:val="0"/>
+          <w:color w:val="auto"/>
+        </w:rPr>
+        <w:t>5)</w:t>
+      </w:r>
+      <w:r>
+        <w:rPr>
+          <w:rFonts w:eastAsiaTheme="minorHAnsi"/>
+          <w:b w:val="0"/>
+          <w:bCs w:val="0"/>
+          <w:color w:val="auto"/>
+        </w:rPr>
+        <w:t>. Like</w:t>
+      </w:r>
+      <w:r>
+        <w:rPr>
+          <w:rFonts w:eastAsiaTheme="minorHAnsi"/>
+          <w:b w:val="0"/>
+          <w:bCs w:val="0"/>
+          <w:color w:val="auto"/>
+        </w:rPr>
+        <w:t xml:space="preserve"> </w:t>
+      </w:r>
+      <w:r>
+        <w:rPr>
+          <w:rFonts w:eastAsiaTheme="minorHAnsi"/>
+          <w:b w:val="0"/>
+          <w:bCs w:val="0"/>
+          <w:color w:val="auto"/>
+        </w:rPr>
+        <w:t xml:space="preserve">on </w:t>
+      </w:r>
+      <w:r>
+        <w:rPr>
+          <w:rFonts w:eastAsiaTheme="minorHAnsi"/>
+          <w:b w:val="0"/>
+          <w:bCs w:val="0"/>
+          <w:color w:val="auto"/>
+        </w:rPr>
+        <w:t xml:space="preserve">the </w:t>
+      </w:r>
+      <w:r>
+        <w:rPr>
+          <w:rFonts w:eastAsiaTheme="minorHAnsi"/>
+          <w:b w:val="0"/>
+          <w:bCs w:val="0"/>
+          <w:color w:val="auto"/>
+        </w:rPr>
+        <w:t>NMDS</w:t>
+      </w:r>
+      <w:r>
+        <w:rPr>
+          <w:rFonts w:eastAsiaTheme="minorHAnsi"/>
+          <w:b w:val="0"/>
+          <w:bCs w:val="0"/>
+          <w:color w:val="auto"/>
+        </w:rPr>
+        <w:t xml:space="preserve"> plot</w:t>
+      </w:r>
+      <w:r>
+        <w:rPr>
+          <w:rFonts w:eastAsiaTheme="minorHAnsi"/>
+          <w:b w:val="0"/>
+          <w:bCs w:val="0"/>
+          <w:color w:val="auto"/>
+        </w:rPr>
+        <w:t xml:space="preserve">, polygons were used to identify the bounds of clusters and vectors </w:t>
+      </w:r>
+      <w:r>
+        <w:rPr>
+          <w:rFonts w:eastAsiaTheme="minorHAnsi"/>
+          <w:b w:val="0"/>
+          <w:bCs w:val="0"/>
+          <w:color w:val="auto"/>
+        </w:rPr>
+        <w:t>reflected</w:t>
+      </w:r>
+      <w:r>
+        <w:rPr>
+          <w:rFonts w:eastAsiaTheme="minorHAnsi"/>
+          <w:b w:val="0"/>
+          <w:bCs w:val="0"/>
+          <w:color w:val="auto"/>
+        </w:rPr>
+        <w:t xml:space="preserve"> the association</w:t>
+      </w:r>
+      <w:r>
+        <w:rPr>
+          <w:rFonts w:eastAsiaTheme="minorHAnsi"/>
+          <w:b w:val="0"/>
+          <w:bCs w:val="0"/>
+          <w:color w:val="auto"/>
+        </w:rPr>
+        <w:t xml:space="preserve">s between covariates and the ordination axes. </w:t>
+      </w:r>
+      <w:r>
+        <w:rPr>
+          <w:rFonts w:eastAsiaTheme="minorHAnsi"/>
+          <w:b w:val="0"/>
+          <w:bCs w:val="0"/>
+          <w:color w:val="auto"/>
+        </w:rPr>
+        <w:t xml:space="preserve">The plot </w:t>
+      </w:r>
+      <w:r>
+        <w:rPr>
+          <w:rFonts w:eastAsiaTheme="minorHAnsi"/>
+          <w:b w:val="0"/>
+          <w:bCs w:val="0"/>
+          <w:color w:val="auto"/>
+        </w:rPr>
+        <w:t>indicated</w:t>
+      </w:r>
+      <w:r>
+        <w:rPr>
+          <w:rFonts w:eastAsiaTheme="minorHAnsi"/>
+          <w:b w:val="0"/>
+          <w:bCs w:val="0"/>
+          <w:color w:val="auto"/>
+        </w:rPr>
+        <w:t xml:space="preserve"> a</w:t>
+      </w:r>
+      <w:r>
+        <w:rPr>
+          <w:rFonts w:eastAsiaTheme="minorHAnsi"/>
+          <w:b w:val="0"/>
+          <w:bCs w:val="0"/>
+          <w:color w:val="auto"/>
+        </w:rPr>
+        <w:t xml:space="preserve"> relatively strong association of the</w:t>
+      </w:r>
+      <w:r>
+        <w:rPr>
+          <w:rFonts w:eastAsiaTheme="minorHAnsi"/>
+          <w:b w:val="0"/>
+          <w:bCs w:val="0"/>
+          <w:color w:val="auto"/>
+        </w:rPr>
+        <w:t xml:space="preserve"> </w:t>
       </w:r>
       <w:r>
         <w:rPr>
@@ -3217,16 +3997,286 @@
           <w:iCs/>
           <w:color w:val="auto"/>
         </w:rPr>
-        <w:t>P. vetulus</w:t>
-      </w:r>
-      <w:r>
-        <w:rPr>
-          <w:rFonts w:eastAsiaTheme="minorHAnsi"/>
-          <w:b w:val="0"/>
-          <w:bCs w:val="0"/>
-          <w:color w:val="auto"/>
-        </w:rPr>
-        <w:t xml:space="preserve"> (cluster 2) and coastal (cluster 6) assemblages both correlated negatively with sea floor depth (m) (Fig. 4). Similarly, the </w:t>
+        <w:t>Sebastes</w:t>
+      </w:r>
+      <w:r>
+        <w:rPr>
+          <w:rFonts w:eastAsiaTheme="minorHAnsi"/>
+          <w:b w:val="0"/>
+          <w:bCs w:val="0"/>
+          <w:color w:val="auto"/>
+        </w:rPr>
+        <w:t xml:space="preserve"> spp. (cluster 1) and Myctophid (cluster 3) assemblages with sea</w:t>
+      </w:r>
+      <w:r>
+        <w:rPr>
+          <w:rFonts w:eastAsiaTheme="minorHAnsi"/>
+          <w:b w:val="0"/>
+          <w:bCs w:val="0"/>
+          <w:color w:val="auto"/>
+        </w:rPr>
+        <w:t>f</w:t>
+      </w:r>
+      <w:r>
+        <w:rPr>
+          <w:rFonts w:eastAsiaTheme="minorHAnsi"/>
+          <w:b w:val="0"/>
+          <w:bCs w:val="0"/>
+          <w:color w:val="auto"/>
+        </w:rPr>
+        <w:t>loor depth</w:t>
+      </w:r>
+      <w:r>
+        <w:rPr>
+          <w:rFonts w:eastAsiaTheme="minorHAnsi"/>
+          <w:b w:val="0"/>
+          <w:bCs w:val="0"/>
+          <w:color w:val="auto"/>
+        </w:rPr>
+        <w:t xml:space="preserve"> (p = </w:t>
+      </w:r>
+      <w:r>
+        <w:rPr>
+          <w:rFonts w:eastAsiaTheme="minorHAnsi"/>
+          <w:b w:val="0"/>
+          <w:bCs w:val="0"/>
+          <w:color w:val="auto"/>
+        </w:rPr>
+        <w:t xml:space="preserve">0.002). </w:t>
+      </w:r>
+      <w:r>
+        <w:rPr>
+          <w:rFonts w:eastAsiaTheme="minorHAnsi"/>
+          <w:b w:val="0"/>
+          <w:bCs w:val="0"/>
+          <w:color w:val="auto"/>
+        </w:rPr>
+        <w:t>These assemblages were also related to</w:t>
+      </w:r>
+      <w:r>
+        <w:rPr>
+          <w:rFonts w:eastAsiaTheme="minorHAnsi"/>
+          <w:b w:val="0"/>
+          <w:bCs w:val="0"/>
+          <w:color w:val="auto"/>
+        </w:rPr>
+        <w:t xml:space="preserve"> mean tow depth</w:t>
+      </w:r>
+      <w:r>
+        <w:rPr>
+          <w:rFonts w:eastAsiaTheme="minorHAnsi"/>
+          <w:b w:val="0"/>
+          <w:bCs w:val="0"/>
+          <w:color w:val="auto"/>
+        </w:rPr>
+        <w:t xml:space="preserve"> (p = 0.001)</w:t>
+      </w:r>
+      <w:r>
+        <w:rPr>
+          <w:rFonts w:eastAsiaTheme="minorHAnsi"/>
+          <w:b w:val="0"/>
+          <w:bCs w:val="0"/>
+          <w:color w:val="auto"/>
+        </w:rPr>
+        <w:t xml:space="preserve"> and </w:t>
+      </w:r>
+      <w:r>
+        <w:rPr>
+          <w:rFonts w:eastAsiaTheme="minorHAnsi"/>
+          <w:b w:val="0"/>
+          <w:bCs w:val="0"/>
+          <w:color w:val="auto"/>
+        </w:rPr>
+        <w:t>salinity</w:t>
+      </w:r>
+      <w:r>
+        <w:rPr>
+          <w:rFonts w:eastAsiaTheme="minorHAnsi"/>
+          <w:b w:val="0"/>
+          <w:bCs w:val="0"/>
+          <w:color w:val="auto"/>
+        </w:rPr>
+        <w:t xml:space="preserve"> (p = 0.001)</w:t>
+      </w:r>
+      <w:r>
+        <w:rPr>
+          <w:rFonts w:eastAsiaTheme="minorHAnsi"/>
+          <w:b w:val="0"/>
+          <w:bCs w:val="0"/>
+          <w:color w:val="auto"/>
+        </w:rPr>
+        <w:t xml:space="preserve"> though </w:t>
+      </w:r>
+      <w:r>
+        <w:rPr>
+          <w:rFonts w:eastAsiaTheme="minorHAnsi"/>
+          <w:b w:val="0"/>
+          <w:bCs w:val="0"/>
+          <w:color w:val="auto"/>
+        </w:rPr>
+        <w:t xml:space="preserve">both had relatively weaker associations on the plot. </w:t>
+      </w:r>
+      <w:r>
+        <w:rPr>
+          <w:rFonts w:eastAsiaTheme="minorHAnsi"/>
+          <w:b w:val="0"/>
+          <w:bCs w:val="0"/>
+          <w:color w:val="auto"/>
+        </w:rPr>
+        <w:t>The Myctophid assemblage</w:t>
+      </w:r>
+      <w:r>
+        <w:rPr>
+          <w:rFonts w:eastAsiaTheme="minorHAnsi"/>
+          <w:b w:val="0"/>
+          <w:bCs w:val="0"/>
+          <w:color w:val="auto"/>
+        </w:rPr>
+        <w:t xml:space="preserve"> (cluster 3)</w:t>
+      </w:r>
+      <w:r>
+        <w:rPr>
+          <w:rFonts w:eastAsiaTheme="minorHAnsi"/>
+          <w:b w:val="0"/>
+          <w:bCs w:val="0"/>
+          <w:color w:val="auto"/>
+        </w:rPr>
+        <w:t xml:space="preserve"> </w:t>
+      </w:r>
+      <w:r>
+        <w:rPr>
+          <w:rFonts w:eastAsiaTheme="minorHAnsi"/>
+          <w:b w:val="0"/>
+          <w:bCs w:val="0"/>
+          <w:color w:val="auto"/>
+        </w:rPr>
+        <w:t xml:space="preserve">alone </w:t>
+      </w:r>
+      <w:r>
+        <w:rPr>
+          <w:rFonts w:eastAsiaTheme="minorHAnsi"/>
+          <w:b w:val="0"/>
+          <w:bCs w:val="0"/>
+          <w:color w:val="auto"/>
+        </w:rPr>
+        <w:t xml:space="preserve">was </w:t>
+      </w:r>
+      <w:r>
+        <w:rPr>
+          <w:rFonts w:eastAsiaTheme="minorHAnsi"/>
+          <w:b w:val="0"/>
+          <w:bCs w:val="0"/>
+          <w:color w:val="auto"/>
+        </w:rPr>
+        <w:t>related</w:t>
+      </w:r>
+      <w:r>
+        <w:rPr>
+          <w:rFonts w:eastAsiaTheme="minorHAnsi"/>
+          <w:b w:val="0"/>
+          <w:bCs w:val="0"/>
+          <w:color w:val="auto"/>
+        </w:rPr>
+        <w:t xml:space="preserve"> </w:t>
+      </w:r>
+      <w:r>
+        <w:rPr>
+          <w:rFonts w:eastAsiaTheme="minorHAnsi"/>
+          <w:b w:val="0"/>
+          <w:bCs w:val="0"/>
+          <w:color w:val="auto"/>
+        </w:rPr>
+        <w:t>to</w:t>
+      </w:r>
+      <w:r>
+        <w:rPr>
+          <w:rFonts w:eastAsiaTheme="minorHAnsi"/>
+          <w:b w:val="0"/>
+          <w:bCs w:val="0"/>
+          <w:color w:val="auto"/>
+        </w:rPr>
+        <w:t xml:space="preserve"> DO</w:t>
+      </w:r>
+      <w:r>
+        <w:rPr>
+          <w:rFonts w:eastAsiaTheme="minorHAnsi"/>
+          <w:b w:val="0"/>
+          <w:bCs w:val="0"/>
+          <w:color w:val="auto"/>
+        </w:rPr>
+        <w:t xml:space="preserve"> (p = </w:t>
+      </w:r>
+      <w:r>
+        <w:rPr>
+          <w:rFonts w:eastAsiaTheme="minorHAnsi"/>
+          <w:b w:val="0"/>
+          <w:bCs w:val="0"/>
+          <w:color w:val="auto"/>
+        </w:rPr>
+        <w:t>0.001)</w:t>
+      </w:r>
+      <w:r>
+        <w:rPr>
+          <w:rFonts w:eastAsiaTheme="minorHAnsi"/>
+          <w:b w:val="0"/>
+          <w:bCs w:val="0"/>
+          <w:color w:val="auto"/>
+        </w:rPr>
+        <w:t xml:space="preserve"> and temperature</w:t>
+      </w:r>
+      <w:r>
+        <w:rPr>
+          <w:rFonts w:eastAsiaTheme="minorHAnsi"/>
+          <w:b w:val="0"/>
+          <w:bCs w:val="0"/>
+          <w:color w:val="auto"/>
+        </w:rPr>
+        <w:t xml:space="preserve"> (p = 0.010)</w:t>
+      </w:r>
+      <w:r>
+        <w:rPr>
+          <w:rFonts w:eastAsiaTheme="minorHAnsi"/>
+          <w:b w:val="0"/>
+          <w:bCs w:val="0"/>
+          <w:color w:val="auto"/>
+        </w:rPr>
+        <w:t>, with the former having</w:t>
+      </w:r>
+      <w:r>
+        <w:rPr>
+          <w:rFonts w:eastAsiaTheme="minorHAnsi"/>
+          <w:b w:val="0"/>
+          <w:bCs w:val="0"/>
+          <w:color w:val="auto"/>
+        </w:rPr>
+        <w:t xml:space="preserve"> a relatively weaker association</w:t>
+      </w:r>
+      <w:r>
+        <w:rPr>
+          <w:rFonts w:eastAsiaTheme="minorHAnsi"/>
+          <w:b w:val="0"/>
+          <w:bCs w:val="0"/>
+          <w:color w:val="auto"/>
+        </w:rPr>
+        <w:t>.</w:t>
+      </w:r>
+      <w:r>
+        <w:rPr>
+          <w:rFonts w:eastAsiaTheme="minorHAnsi"/>
+          <w:b w:val="0"/>
+          <w:bCs w:val="0"/>
+          <w:color w:val="auto"/>
+        </w:rPr>
+        <w:t xml:space="preserve"> </w:t>
+      </w:r>
+      <w:r>
+        <w:rPr>
+          <w:rFonts w:eastAsiaTheme="minorHAnsi"/>
+          <w:b w:val="0"/>
+          <w:bCs w:val="0"/>
+          <w:color w:val="auto"/>
+        </w:rPr>
+        <w:t>Chl-</w:t>
       </w:r>
       <w:r>
         <w:rPr>
@@ -3237,6 +4287,136 @@
           <w:iCs/>
           <w:color w:val="auto"/>
         </w:rPr>
+        <w:t>a</w:t>
+      </w:r>
+      <w:r>
+        <w:rPr>
+          <w:rFonts w:eastAsiaTheme="minorHAnsi"/>
+          <w:b w:val="0"/>
+          <w:bCs w:val="0"/>
+          <w:color w:val="auto"/>
+        </w:rPr>
+        <w:t xml:space="preserve"> </w:t>
+      </w:r>
+      <w:r>
+        <w:rPr>
+          <w:rFonts w:eastAsiaTheme="minorHAnsi"/>
+          <w:b w:val="0"/>
+          <w:bCs w:val="0"/>
+          <w:color w:val="auto"/>
+        </w:rPr>
+        <w:t>(p = 0.001)</w:t>
+      </w:r>
+      <w:r>
+        <w:rPr>
+          <w:rFonts w:eastAsiaTheme="minorHAnsi"/>
+          <w:b w:val="0"/>
+          <w:bCs w:val="0"/>
+          <w:color w:val="auto"/>
+        </w:rPr>
+        <w:t xml:space="preserve"> associated relatively strongly with the </w:t>
+      </w:r>
+      <w:r>
+        <w:rPr>
+          <w:rFonts w:eastAsiaTheme="minorHAnsi"/>
+          <w:b w:val="0"/>
+          <w:bCs w:val="0"/>
+          <w:i/>
+          <w:iCs/>
+          <w:color w:val="auto"/>
+        </w:rPr>
+        <w:t>P. vetulus</w:t>
+      </w:r>
+      <w:r>
+        <w:rPr>
+          <w:rFonts w:eastAsiaTheme="minorHAnsi"/>
+          <w:b w:val="0"/>
+          <w:bCs w:val="0"/>
+          <w:color w:val="auto"/>
+        </w:rPr>
+        <w:t xml:space="preserve"> and </w:t>
+      </w:r>
+      <w:r>
+        <w:rPr>
+          <w:rFonts w:eastAsiaTheme="minorHAnsi"/>
+          <w:b w:val="0"/>
+          <w:bCs w:val="0"/>
+          <w:color w:val="auto"/>
+        </w:rPr>
+        <w:t xml:space="preserve">Osmeridae </w:t>
+      </w:r>
+      <w:r>
+        <w:rPr>
+          <w:rFonts w:eastAsiaTheme="minorHAnsi"/>
+          <w:b w:val="0"/>
+          <w:bCs w:val="0"/>
+          <w:color w:val="auto"/>
+        </w:rPr>
+        <w:t>assemblages (clusters 2 and 6, respectively)</w:t>
+      </w:r>
+      <w:r>
+        <w:rPr>
+          <w:rFonts w:eastAsiaTheme="minorHAnsi"/>
+          <w:b w:val="0"/>
+          <w:bCs w:val="0"/>
+          <w:color w:val="auto"/>
+        </w:rPr>
+        <w:t>.</w:t>
+      </w:r>
+      <w:r>
+        <w:rPr>
+          <w:rFonts w:eastAsiaTheme="minorHAnsi"/>
+          <w:b w:val="0"/>
+          <w:bCs w:val="0"/>
+          <w:color w:val="auto"/>
+        </w:rPr>
+        <w:t xml:space="preserve"> The </w:t>
+      </w:r>
+      <w:r>
+        <w:rPr>
+          <w:rFonts w:eastAsiaTheme="minorHAnsi"/>
+          <w:b w:val="0"/>
+          <w:bCs w:val="0"/>
+          <w:color w:val="auto"/>
+        </w:rPr>
+        <w:t>general nearshore assemblage (cluster 5) was related strongly to latitude</w:t>
+      </w:r>
+      <w:r>
+        <w:rPr>
+          <w:rFonts w:eastAsiaTheme="minorHAnsi"/>
+          <w:b w:val="0"/>
+          <w:bCs w:val="0"/>
+          <w:color w:val="auto"/>
+        </w:rPr>
+        <w:t xml:space="preserve"> (p = </w:t>
+      </w:r>
+      <w:r>
+        <w:rPr>
+          <w:rFonts w:eastAsiaTheme="minorHAnsi"/>
+          <w:b w:val="0"/>
+          <w:bCs w:val="0"/>
+          <w:color w:val="auto"/>
+        </w:rPr>
+        <w:t xml:space="preserve">0.001). </w:t>
+      </w:r>
+      <w:r>
+        <w:rPr>
+          <w:rFonts w:eastAsiaTheme="minorHAnsi"/>
+          <w:b w:val="0"/>
+          <w:bCs w:val="0"/>
+          <w:color w:val="auto"/>
+        </w:rPr>
+        <w:t xml:space="preserve">This assemblage, along with the </w:t>
+      </w:r>
+      <w:r>
+        <w:rPr>
+          <w:rFonts w:eastAsiaTheme="minorHAnsi"/>
+          <w:b w:val="0"/>
+          <w:bCs w:val="0"/>
+          <w:i/>
+          <w:iCs/>
+          <w:color w:val="auto"/>
+        </w:rPr>
         <w:t>Sebastes</w:t>
       </w:r>
       <w:r>
@@ -3246,39 +4426,28 @@
           <w:bCs w:val="0"/>
           <w:color w:val="auto"/>
         </w:rPr>
-        <w:t xml:space="preserve"> spp. (cluster 1) and Myctophid (cluster 3) communities appeared to correlate negatively with mean sampling depth (m) (Fig. 4). Cluster 3, as well as cluster 5, appeared to correlate negatively with latitude (Fig. 4). The nearshore community (cluster 5) additionally was correlated somewhat with the variable “daytime” (Fig. 4). </w:t>
-      </w:r>
-    </w:p>
-    <w:p>
-      <w:pPr>
-        <w:pStyle w:val="Heading2"/>
-        <w:rPr>
-          <w:rFonts w:eastAsiaTheme="minorHAnsi"/>
-          <w:b w:val="0"/>
-          <w:bCs w:val="0"/>
-          <w:color w:val="auto"/>
-        </w:rPr>
-      </w:pPr>
-      <w:r>
-        <w:rPr>
-          <w:rFonts w:eastAsiaTheme="minorHAnsi"/>
-          <w:b w:val="0"/>
-          <w:bCs w:val="0"/>
-          <w:color w:val="auto"/>
-        </w:rPr>
-        <w:t xml:space="preserve">To assess the fit of the NMDS ordination to the data, stress was measured. The stress statistic resulting from the NMDS, </w:t>
-      </w:r>
-      <w:commentRangeStart w:id="24"/>
-      <w:r>
-        <w:rPr>
-          <w:rFonts w:eastAsiaTheme="minorHAnsi"/>
-          <w:b w:val="0"/>
-          <w:bCs w:val="0"/>
-          <w:color w:val="auto"/>
-        </w:rPr>
-        <w:t>0.2006</w:t>
-      </w:r>
-      <w:commentRangeEnd w:id="24"/>
+        <w:t xml:space="preserve"> spp. assemblage, was also associated with time of day (p = </w:t>
+      </w:r>
+      <w:r>
+        <w:rPr>
+          <w:rFonts w:eastAsiaTheme="minorHAnsi"/>
+          <w:b w:val="0"/>
+          <w:bCs w:val="0"/>
+          <w:color w:val="auto"/>
+        </w:rPr>
+        <w:t>0.027)</w:t>
+      </w:r>
+      <w:commentRangeStart w:id="23"/>
+      <w:r>
+        <w:rPr>
+          <w:rFonts w:eastAsiaTheme="minorHAnsi"/>
+          <w:b w:val="0"/>
+          <w:bCs w:val="0"/>
+          <w:color w:val="auto"/>
+        </w:rPr>
+        <w:t>.</w:t>
+      </w:r>
+      <w:commentRangeEnd w:id="23"/>
       <w:r>
         <w:rPr>
           <w:rStyle w:val="CommentReference"/>
@@ -3289,141 +4458,7 @@
           <w:sz w:val="24"/>
           <w:szCs w:val="24"/>
         </w:rPr>
-        <w:commentReference w:id="24"/>
-      </w:r>
-      <w:r>
-        <w:rPr>
-          <w:rFonts w:eastAsiaTheme="minorHAnsi"/>
-          <w:b w:val="0"/>
-          <w:bCs w:val="0"/>
-          <w:color w:val="auto"/>
-        </w:rPr>
-        <w:t xml:space="preserve">, would generally be considered indicative of a poor fit to the data (stress &gt; 0.2). However, in the same paper that first proposed this common interpretation, Clarke (1993) warned against using his guideline as a hard cutoff and </w:t>
-      </w:r>
-      <w:r>
-        <w:rPr>
-          <w:rFonts w:eastAsiaTheme="minorHAnsi"/>
-          <w:b w:val="0"/>
-          <w:bCs w:val="0"/>
-          <w:color w:val="auto"/>
-        </w:rPr>
-        <w:t>over relying</w:t>
-      </w:r>
-      <w:r>
-        <w:rPr>
-          <w:rFonts w:eastAsiaTheme="minorHAnsi"/>
-          <w:b w:val="0"/>
-          <w:bCs w:val="0"/>
-          <w:color w:val="auto"/>
-        </w:rPr>
-        <w:t xml:space="preserve"> on stress for evaluating ordination fit. Because the stress value was close to the 0.2 ceiling and our data may have been susceptible to the general tendency of large datasets to yield greater stress values, we further investigated NMDS stress with an iterative permutation model developed by Dexter et al. (2018). In this, we assessed the null hypothesis that the community was not systematically structured with a one sample z-test. Our result supported rejection of this null hypothesis (</w:t>
-      </w:r>
-      <w:commentRangeStart w:id="25"/>
-      <w:r>
-        <w:rPr>
-          <w:rFonts w:eastAsiaTheme="minorHAnsi"/>
-          <w:b w:val="0"/>
-          <w:bCs w:val="0"/>
-          <w:color w:val="auto"/>
-        </w:rPr>
-        <w:t>p =  4.5222 10-96</w:t>
-      </w:r>
-      <w:commentRangeEnd w:id="25"/>
-      <w:r>
-        <w:rPr>
-          <w:rStyle w:val="CommentReference"/>
-          <w:rFonts w:eastAsiaTheme="minorHAnsi"/>
-          <w:b w:val="0"/>
-          <w:bCs w:val="0"/>
-          <w:color w:val="auto"/>
-          <w:sz w:val="24"/>
-          <w:szCs w:val="24"/>
-        </w:rPr>
-        <w:commentReference w:id="25"/>
-      </w:r>
-      <w:r>
-        <w:rPr>
-          <w:rFonts w:eastAsiaTheme="minorHAnsi"/>
-          <w:b w:val="0"/>
-          <w:bCs w:val="0"/>
-          <w:color w:val="auto"/>
-        </w:rPr>
-        <w:t>) and justified use of the ordination for biological interpretation.</w:t>
-      </w:r>
-    </w:p>
-    <w:p>
-      <w:pPr>
-        <w:pStyle w:val="Heading2"/>
-        <w:rPr>
-          <w:rFonts w:eastAsiaTheme="minorHAnsi"/>
-          <w:b w:val="0"/>
-          <w:bCs w:val="0"/>
-          <w:color w:val="auto"/>
-        </w:rPr>
-      </w:pPr>
-      <w:r>
-        <w:rPr>
-          <w:rFonts w:eastAsiaTheme="minorHAnsi"/>
-          <w:b w:val="0"/>
-          <w:bCs w:val="0"/>
-          <w:color w:val="auto"/>
-        </w:rPr>
-        <w:t>Distance-based redundancy analysis (db-RDA) and variance partitioning analysis (VPA) were run on the data to more clearly investigate the effects of variables on the LFC. A model with only spatiotemporal variables and a model with spatiotemporal and environmental variables were both found to explain a significant amount of variance in the community (p-values &lt; 0.05). Comparison of these models found a significant increase in explanatory power with the introduction of environmental variables to the spatiotemporal-only model (</w:t>
-      </w:r>
-      <w:commentRangeStart w:id="26"/>
-      <w:r>
-        <w:rPr>
-          <w:rFonts w:eastAsiaTheme="minorHAnsi"/>
-          <w:b w:val="0"/>
-          <w:bCs w:val="0"/>
-          <w:color w:val="auto"/>
-        </w:rPr>
-        <w:t>p = …</w:t>
-      </w:r>
-      <w:commentRangeEnd w:id="26"/>
-      <w:r>
-        <w:rPr>
-          <w:rStyle w:val="CommentReference"/>
-          <w:rFonts w:eastAsiaTheme="minorHAnsi"/>
-          <w:b w:val="0"/>
-          <w:bCs w:val="0"/>
-          <w:color w:val="auto"/>
-          <w:sz w:val="24"/>
-          <w:szCs w:val="24"/>
-        </w:rPr>
-        <w:commentReference w:id="26"/>
-      </w:r>
-      <w:r>
-        <w:rPr>
-          <w:rFonts w:eastAsiaTheme="minorHAnsi"/>
-          <w:b w:val="0"/>
-          <w:bCs w:val="0"/>
-          <w:color w:val="auto"/>
-        </w:rPr>
-        <w:t>). VPA indicated that about 4.04% of variance was explained by spatiotemporal variables alone</w:t>
-      </w:r>
-      <w:commentRangeStart w:id="27"/>
-      <w:r>
-        <w:rPr>
-          <w:rFonts w:eastAsiaTheme="minorHAnsi"/>
-          <w:b w:val="0"/>
-          <w:bCs w:val="0"/>
-          <w:color w:val="auto"/>
-        </w:rPr>
-        <w:t>.</w:t>
-      </w:r>
-      <w:commentRangeEnd w:id="27"/>
-      <w:r>
-        <w:rPr>
-          <w:rStyle w:val="CommentReference"/>
-          <w:rFonts w:eastAsiaTheme="minorHAnsi"/>
-          <w:b w:val="0"/>
-          <w:bCs w:val="0"/>
-          <w:color w:val="auto"/>
-          <w:sz w:val="24"/>
-          <w:szCs w:val="24"/>
-        </w:rPr>
-        <w:commentReference w:id="27"/>
+        <w:commentReference w:id="23"/>
       </w:r>
     </w:p>
     <w:p>
@@ -3444,10 +4479,11 @@
     <w:p>
       <w:pPr>
         <w:rPr>
-          <w:del w:id="28" w:author="Bobay, Luke Andrew" w:date="2026-08-28T18:22:00Z" w16du:dateUtc="2026-08-29T01:22:00Z"/>
+          <w:del w:id="24" w:author="Bobay, Luke Andrew" w:date="2026-08-28T18:22:00Z" w16du:dateUtc="2026-08-29T01:22:00Z"/>
         </w:rPr>
       </w:pPr>
       <w:r>
+        <w:lastRenderedPageBreak/>
         <w:t xml:space="preserve"> In the GLMM of ichthyoplankton </w:t>
       </w:r>
       <w:r>
@@ -3556,7 +4592,13 @@
         <w:t>depths</w:t>
       </w:r>
       <w:r>
-        <w:t xml:space="preserve"> (Agonidae), during nighttime and in the deepest sampled </w:t>
+        <w:t xml:space="preserve"> (Agonidae)</w:t>
+      </w:r>
+      <w:r>
+        <w:t>;</w:t>
+      </w:r>
+      <w:r>
+        <w:t xml:space="preserve"> during nighttime and in the deepest sampled </w:t>
       </w:r>
       <w:r>
         <w:t>depths</w:t>
@@ -3572,7 +4614,13 @@
         <w:t xml:space="preserve">Protomyctophum </w:t>
       </w:r>
       <w:r>
-        <w:t xml:space="preserve">spp.), during nighttime across all sampled </w:t>
+        <w:t>spp.)</w:t>
+      </w:r>
+      <w:r>
+        <w:t xml:space="preserve">; </w:t>
+      </w:r>
+      <w:r>
+        <w:t xml:space="preserve">during nighttime across all sampled </w:t>
       </w:r>
       <w:r>
         <w:t>depths</w:t>
@@ -3598,7 +4646,13 @@
         <w:t>Tarletonbeania crenularis</w:t>
       </w:r>
       <w:r>
-        <w:t>), during nighttime and in the shallowest sampled depths (</w:t>
+        <w:t>)</w:t>
+      </w:r>
+      <w:r>
+        <w:t xml:space="preserve">; </w:t>
+      </w:r>
+      <w:r>
+        <w:t>during nighttime and in the shallowest sampled depths (</w:t>
       </w:r>
       <w:r>
         <w:rPr>
@@ -3618,7 +4672,13 @@
         <w:t>Lestidiops ringens</w:t>
       </w:r>
       <w:r>
-        <w:t>), throughout the full day at the shallowest sampled depths (</w:t>
+        <w:t>)</w:t>
+      </w:r>
+      <w:r>
+        <w:t xml:space="preserve">; </w:t>
+      </w:r>
+      <w:r>
+        <w:t>throughout the full day at the shallowest sampled depths (</w:t>
       </w:r>
       <w:r>
         <w:rPr>
@@ -3628,7 +4688,13 @@
         <w:t>e.g.</w:t>
       </w:r>
       <w:r>
-        <w:t>, Ammodytidae), during daytime and at the shallowest sampled depths (</w:t>
+        <w:t>, Ammodytidae)</w:t>
+      </w:r>
+      <w:r>
+        <w:t xml:space="preserve">; </w:t>
+      </w:r>
+      <w:r>
+        <w:t>during daytime and at the shallowest sampled depths (</w:t>
       </w:r>
       <w:r>
         <w:rPr>
@@ -3638,7 +4704,16 @@
         <w:t>e.g.</w:t>
       </w:r>
       <w:r>
-        <w:t>, Osmeridae), and during nighttime at the deepest sampled depths and during daytime at the shallowest sampled depths (</w:t>
+        <w:t>, Osmeridae)</w:t>
+      </w:r>
+      <w:r>
+        <w:t>;</w:t>
+      </w:r>
+      <w:r>
+        <w:t xml:space="preserve"> </w:t>
+      </w:r>
+      <w:r>
+        <w:t>and during nighttime at the deepest sampled depths and during daytime at the shallowest sampled depths (</w:t>
       </w:r>
       <w:r>
         <w:rPr>
@@ -3655,65 +4730,75 @@
           <w:i/>
           <w:iCs/>
         </w:rPr>
-        <w:t>Stenobrachius leucopsarus</w:t>
-      </w:r>
-      <w:r>
-        <w:t xml:space="preserve">) (Fig. 6). </w:t>
-      </w:r>
-      <w:r>
-        <w:t>T</w:t>
-      </w:r>
-      <w:r>
-        <w:t xml:space="preserve">he total abundance </w:t>
-      </w:r>
-      <w:r>
-        <w:t>of larvae in the sampled portion of the water column</w:t>
-      </w:r>
-      <w:r>
-        <w:t xml:space="preserve"> </w:t>
-      </w:r>
-      <w:r>
-        <w:lastRenderedPageBreak/>
-        <w:t xml:space="preserve">varies </w:t>
-      </w:r>
-      <w:r>
-        <w:t xml:space="preserve">substantially </w:t>
-      </w:r>
-      <w:r>
-        <w:t>over the course of a day</w:t>
-      </w:r>
-      <w:r>
-        <w:t xml:space="preserve"> for some taxa</w:t>
-      </w:r>
-      <w:r>
-        <w:t xml:space="preserve"> (</w:t>
+        <w:t>S.</w:t>
       </w:r>
       <w:r>
         <w:rPr>
           <w:i/>
           <w:iCs/>
         </w:rPr>
-        <w:t>e.g.</w:t>
-      </w:r>
-      <w:r>
-        <w:t xml:space="preserve">, </w:t>
+        <w:t xml:space="preserve"> leucopsarus</w:t>
+      </w:r>
+      <w:r>
+        <w:t xml:space="preserve">) (Fig. 6). </w:t>
+      </w:r>
+      <w:r>
+        <w:t>T</w:t>
+      </w:r>
+      <w:r>
+        <w:t xml:space="preserve">he total abundance </w:t>
+      </w:r>
+      <w:r>
+        <w:t>of larvae in the sampled portion of the water column</w:t>
+      </w:r>
+      <w:r>
+        <w:t xml:space="preserve"> varies </w:t>
+      </w:r>
+      <w:r>
+        <w:t xml:space="preserve">substantially </w:t>
+      </w:r>
+      <w:r>
+        <w:t>over the course of a day</w:t>
+      </w:r>
+      <w:r>
+        <w:t xml:space="preserve"> for some taxa</w:t>
+      </w:r>
+      <w:r>
+        <w:t xml:space="preserve"> (</w:t>
       </w:r>
       <w:r>
         <w:rPr>
           <w:i/>
           <w:iCs/>
         </w:rPr>
-        <w:t>Bathylagus ochotensis</w:t>
-      </w:r>
-      <w:r>
-        <w:t xml:space="preserve"> and </w:t>
+        <w:t>e.g.</w:t>
+      </w:r>
+      <w:r>
+        <w:t xml:space="preserve">, </w:t>
       </w:r>
       <w:r>
         <w:rPr>
           <w:i/>
           <w:iCs/>
         </w:rPr>
-        <w:t>Stenobrachius leucopsarus</w:t>
+        <w:t>Bathylagus ochotensis</w:t>
+      </w:r>
+      <w:r>
+        <w:t xml:space="preserve"> and </w:t>
+      </w:r>
+      <w:r>
+        <w:rPr>
+          <w:i/>
+          <w:iCs/>
+        </w:rPr>
+        <w:t>S.</w:t>
+      </w:r>
+      <w:r>
+        <w:rPr>
+          <w:i/>
+          <w:iCs/>
+        </w:rPr>
+        <w:t xml:space="preserve"> leucopsarus</w:t>
       </w:r>
       <w:r>
         <w:t>) but not others (</w:t>
@@ -3878,7 +4963,7 @@
       </w:r>
     </w:p>
   </w:comment>
-  <w:comment w:id="6" w:author="Bobay, Luke Andrew" w:date="2026-08-28T07:42:00Z" w:initials="LB">
+  <w:comment w:id="4" w:author="Bobay, Luke Andrew" w:date="2026-08-28T07:42:00Z" w:initials="LB">
     <w:p>
       <w:pPr>
         <w:pStyle w:val="CommentText"/>
@@ -3894,7 +4979,7 @@
       </w:r>
     </w:p>
   </w:comment>
-  <w:comment w:id="11" w:author="McCloskey, Ross" w:date="2026-08-18T15:06:00Z" w:initials="RM">
+  <w:comment w:id="6" w:author="McCloskey, Ross" w:date="2026-08-18T15:06:00Z" w:initials="RM">
     <w:p>
       <w:pPr>
         <w:pStyle w:val="CommentText"/>
@@ -3910,7 +4995,7 @@
       </w:r>
     </w:p>
   </w:comment>
-  <w:comment w:id="13" w:author="McCloskey, Ross" w:date="2026-08-18T15:12:00Z" w:initials="RM">
+  <w:comment w:id="8" w:author="McCloskey, Ross" w:date="2026-08-18T15:12:00Z" w:initials="RM">
     <w:p>
       <w:pPr>
         <w:pStyle w:val="CommentText"/>
@@ -3926,7 +5011,7 @@
       </w:r>
     </w:p>
   </w:comment>
-  <w:comment w:id="14" w:author="McCloskey, Ross" w:date="2026-08-25T13:29:00Z" w:initials="RM">
+  <w:comment w:id="9" w:author="McCloskey, Ross" w:date="2026-08-25T13:29:00Z" w:initials="RM">
     <w:p>
       <w:pPr>
         <w:pStyle w:val="CommentText"/>
@@ -3942,7 +5027,7 @@
       </w:r>
     </w:p>
   </w:comment>
-  <w:comment w:id="15" w:author="Bobay, Luke Andrew" w:date="2026-08-28T14:13:00Z" w:initials="LB">
+  <w:comment w:id="10" w:author="Bobay, Luke Andrew" w:date="2026-08-28T14:13:00Z" w:initials="LB">
     <w:p>
       <w:pPr>
         <w:pStyle w:val="CommentText"/>
@@ -3958,7 +5043,7 @@
       </w:r>
     </w:p>
   </w:comment>
-  <w:comment w:id="12" w:author="Bobay, Luke Andrew" w:date="2026-08-28T09:18:00Z" w:initials="LB">
+  <w:comment w:id="7" w:author="Bobay, Luke Andrew" w:date="2026-08-28T09:18:00Z" w:initials="LB">
     <w:p>
       <w:pPr>
         <w:pStyle w:val="CommentText"/>
@@ -3974,7 +5059,7 @@
       </w:r>
     </w:p>
   </w:comment>
-  <w:comment w:id="17" w:author="McCloskey, Ross" w:date="2026-08-18T15:29:00Z" w:initials="RM">
+  <w:comment w:id="11" w:author="McCloskey, Ross" w:date="2026-08-18T15:29:00Z" w:initials="RM">
     <w:p>
       <w:pPr>
         <w:pStyle w:val="CommentText"/>
@@ -3998,7 +5083,7 @@
       </w:r>
     </w:p>
   </w:comment>
-  <w:comment w:id="18" w:author="Bobay, Luke Andrew" w:date="2026-08-28T14:16:00Z" w:initials="LB">
+  <w:comment w:id="12" w:author="Bobay, Luke Andrew" w:date="2026-08-28T14:16:00Z" w:initials="LB">
     <w:p>
       <w:pPr>
         <w:pStyle w:val="CommentText"/>
@@ -4014,7 +5099,7 @@
       </w:r>
     </w:p>
   </w:comment>
-  <w:comment w:id="19" w:author="McCloskey, Ross" w:date="2026-08-18T14:58:00Z" w:initials="RM">
+  <w:comment w:id="13" w:author="McCloskey, Ross" w:date="2026-09-07T11:52:00Z" w:initials="RM">
     <w:p>
       <w:pPr>
         <w:pStyle w:val="CommentText"/>
@@ -4026,11 +5111,11 @@
         <w:annotationRef/>
       </w:r>
       <w:r>
-        <w:t>Add version and citation</w:t>
+        <w:t>I can’t recall if these are still the thresholds we used so may need to edit.</w:t>
       </w:r>
     </w:p>
   </w:comment>
-  <w:comment w:id="20" w:author="McCloskey, Ross" w:date="2026-09-03T17:40:00Z" w:initials="RM">
+  <w:comment w:id="14" w:author="McCloskey, Ross" w:date="2026-08-18T14:58:00Z" w:initials="RM">
     <w:p>
       <w:pPr>
         <w:pStyle w:val="CommentText"/>
@@ -4042,11 +5127,11 @@
         <w:annotationRef/>
       </w:r>
       <w:r>
-        <w:t>Should we also be citing the R packages we’re using like vegan and such?</w:t>
+        <w:t>Add version and citation</w:t>
       </w:r>
     </w:p>
   </w:comment>
-  <w:comment w:id="21" w:author="McCloskey, Ross" w:date="2026-09-03T17:25:00Z" w:initials="RM">
+  <w:comment w:id="15" w:author="McCloskey, Ross" w:date="2026-09-03T17:40:00Z" w:initials="RM">
     <w:p>
       <w:pPr>
         <w:pStyle w:val="CommentText"/>
@@ -4058,11 +5143,11 @@
         <w:annotationRef/>
       </w:r>
       <w:r>
-        <w:t>Is there another, better word for this? Or is it okay as is?</w:t>
+        <w:t>Should we also be citing the R packages we’re using like vegan and such?</w:t>
       </w:r>
     </w:p>
   </w:comment>
-  <w:comment w:id="23" w:author="McCloskey, Ross" w:date="2026-09-03T18:06:00Z" w:initials="RM">
+  <w:comment w:id="17" w:author="McCloskey, Ross" w:date="2026-09-07T12:07:00Z" w:initials="RM">
     <w:p>
       <w:pPr>
         <w:pStyle w:val="CommentText"/>
@@ -4074,11 +5159,11 @@
         <w:annotationRef/>
       </w:r>
       <w:r>
-        <w:t>This paragraph feels clunky and like it could use more explanation. Will rework.</w:t>
+        <w:t>Since these are the first times the species are mentioned, do we use the full genus? Do we need to include in parentheses the shortened nomenclature we’ll be using or is it okay as is?</w:t>
       </w:r>
     </w:p>
   </w:comment>
-  <w:comment w:id="24" w:author="McCloskey, Ross" w:date="2026-09-03T18:06:00Z" w:initials="RM">
+  <w:comment w:id="18" w:author="McCloskey, Ross" w:date="2026-09-07T12:10:00Z" w:initials="RM">
     <w:p>
       <w:pPr>
         <w:pStyle w:val="CommentText"/>
@@ -4090,11 +5175,11 @@
         <w:annotationRef/>
       </w:r>
       <w:r>
-        <w:t>Need to check this is still the correct stress statistic with the final data</w:t>
+        <w:t>Do we also need to cite the taxonomic authorities for these?</w:t>
       </w:r>
     </w:p>
   </w:comment>
-  <w:comment w:id="25" w:author="McCloskey, Ross" w:date="2026-09-03T18:07:00Z" w:initials="RM">
+  <w:comment w:id="19" w:author="McCloskey, Ross" w:date="2026-09-03T18:06:00Z" w:initials="RM">
     <w:p>
       <w:pPr>
         <w:pStyle w:val="CommentText"/>
@@ -4106,11 +5191,11 @@
         <w:annotationRef/>
       </w:r>
       <w:r>
-        <w:t>Like above, need to check that this is still the correct value with the final data</w:t>
+        <w:t>Need to check this is still the correct stress statistic with the final data</w:t>
       </w:r>
     </w:p>
   </w:comment>
-  <w:comment w:id="26" w:author="McCloskey, Ross" w:date="2026-09-03T18:07:00Z" w:initials="RM">
+  <w:comment w:id="20" w:author="McCloskey, Ross" w:date="2026-09-03T18:07:00Z" w:initials="RM">
     <w:p>
       <w:pPr>
         <w:pStyle w:val="CommentText"/>
@@ -4122,11 +5207,11 @@
         <w:annotationRef/>
       </w:r>
       <w:r>
-        <w:t>Need this p-value</w:t>
+        <w:t>Like above, need to check that this is still the correct value with the final data</w:t>
       </w:r>
     </w:p>
   </w:comment>
-  <w:comment w:id="27" w:author="McCloskey, Ross" w:date="2026-09-03T18:07:00Z" w:initials="RM">
+  <w:comment w:id="21" w:author="McCloskey, Ross" w:date="2026-09-03T18:07:00Z" w:initials="RM">
     <w:p>
       <w:pPr>
         <w:pStyle w:val="CommentText"/>
@@ -4138,7 +5223,39 @@
         <w:annotationRef/>
       </w:r>
       <w:r>
-        <w:t>Need to finish this paragraph still</w:t>
+        <w:t>Need this p-value</w:t>
+      </w:r>
+    </w:p>
+  </w:comment>
+  <w:comment w:id="22" w:author="McCloskey, Ross" w:date="2026-09-07T12:33:00Z" w:initials="RM">
+    <w:p>
+      <w:pPr>
+        <w:pStyle w:val="CommentText"/>
+      </w:pPr>
+      <w:r>
+        <w:rPr>
+          <w:rStyle w:val="CommentReference"/>
+        </w:rPr>
+        <w:annotationRef/>
+      </w:r>
+      <w:r>
+        <w:t>Got these values from the bottom right table on slide 8. I don’t know if I’m interpreting/describing this right, though.</w:t>
+      </w:r>
+    </w:p>
+  </w:comment>
+  <w:comment w:id="23" w:author="McCloskey, Ross" w:date="2026-09-07T13:29:00Z" w:initials="RM">
+    <w:p>
+      <w:pPr>
+        <w:pStyle w:val="CommentText"/>
+      </w:pPr>
+      <w:r>
+        <w:rPr>
+          <w:rStyle w:val="CommentReference"/>
+        </w:rPr>
+        <w:annotationRef/>
+      </w:r>
+      <w:r>
+        <w:t>I took a stab at this but I don’t know if I’m interpreting or phrasing this correctly. Could maybe be more eloquent since this is kind of clunky to read.</w:t>
       </w:r>
     </w:p>
   </w:comment>
@@ -4159,14 +5276,16 @@
   <w15:commentEx w15:paraId="776556A8" w15:done="0"/>
   <w15:commentEx w15:paraId="763D8A91" w15:done="0"/>
   <w15:commentEx w15:paraId="0A2C9749" w15:paraIdParent="763D8A91" w15:done="0"/>
+  <w15:commentEx w15:paraId="674FD3BE" w15:done="0"/>
   <w15:commentEx w15:paraId="1F69DA66" w15:done="0"/>
   <w15:commentEx w15:paraId="5D36C521" w15:paraIdParent="1F69DA66" w15:done="0"/>
-  <w15:commentEx w15:paraId="370F21C0" w15:done="0"/>
-  <w15:commentEx w15:paraId="7FCF3F69" w15:done="0"/>
+  <w15:commentEx w15:paraId="1AEF4160" w15:done="0"/>
+  <w15:commentEx w15:paraId="5C9098B6" w15:paraIdParent="1AEF4160" w15:done="0"/>
   <w15:commentEx w15:paraId="60EFF882" w15:done="0"/>
   <w15:commentEx w15:paraId="11847F66" w15:done="0"/>
   <w15:commentEx w15:paraId="61CF42B2" w15:done="0"/>
-  <w15:commentEx w15:paraId="535F35E9" w15:done="0"/>
+  <w15:commentEx w15:paraId="457EC8E9" w15:done="0"/>
+  <w15:commentEx w15:paraId="240AE705" w15:done="0"/>
 </w15:commentsEx>
 </file>
 
@@ -4232,14 +5351,16 @@
       </w16:ext>
     </w16cex:extLst>
   </w16cex:commentExtensible>
+  <w16cex:commentExtensible w16cex:durableId="0E35137F" w16cex:dateUtc="2026-09-07T18:52:00Z"/>
   <w16cex:commentExtensible w16cex:durableId="120E2433" w16cex:dateUtc="2026-08-18T19:58:00Z"/>
   <w16cex:commentExtensible w16cex:durableId="24A17EB3" w16cex:dateUtc="2026-09-04T00:40:00Z"/>
-  <w16cex:commentExtensible w16cex:durableId="3D9EF0B9" w16cex:dateUtc="2026-09-04T00:25:00Z"/>
-  <w16cex:commentExtensible w16cex:durableId="1940A100" w16cex:dateUtc="2026-09-04T01:06:00Z"/>
+  <w16cex:commentExtensible w16cex:durableId="2D06587C" w16cex:dateUtc="2026-09-07T19:07:00Z"/>
+  <w16cex:commentExtensible w16cex:durableId="4C2C3F5B" w16cex:dateUtc="2026-09-07T19:10:00Z"/>
   <w16cex:commentExtensible w16cex:durableId="1803F2CB" w16cex:dateUtc="2026-09-04T01:06:00Z"/>
   <w16cex:commentExtensible w16cex:durableId="2CEF65EE" w16cex:dateUtc="2026-09-04T01:07:00Z"/>
   <w16cex:commentExtensible w16cex:durableId="390A3A60" w16cex:dateUtc="2026-09-04T01:07:00Z"/>
-  <w16cex:commentExtensible w16cex:durableId="7E954B93" w16cex:dateUtc="2026-09-04T01:07:00Z"/>
+  <w16cex:commentExtensible w16cex:durableId="285C1B87" w16cex:dateUtc="2026-09-07T19:33:00Z"/>
+  <w16cex:commentExtensible w16cex:durableId="2526330B" w16cex:dateUtc="2026-09-07T20:29:00Z"/>
 </w16cex:commentsExtensible>
 </file>
 
@@ -4257,14 +5378,16 @@
   <w16cid:commentId w16cid:paraId="776556A8" w16cid:durableId="318C9CE1"/>
   <w16cid:commentId w16cid:paraId="763D8A91" w16cid:durableId="167F67C8"/>
   <w16cid:commentId w16cid:paraId="0A2C9749" w16cid:durableId="60C23C39"/>
+  <w16cid:commentId w16cid:paraId="674FD3BE" w16cid:durableId="0E35137F"/>
   <w16cid:commentId w16cid:paraId="1F69DA66" w16cid:durableId="120E2433"/>
   <w16cid:commentId w16cid:paraId="5D36C521" w16cid:durableId="24A17EB3"/>
-  <w16cid:commentId w16cid:paraId="370F21C0" w16cid:durableId="3D9EF0B9"/>
-  <w16cid:commentId w16cid:paraId="7FCF3F69" w16cid:durableId="1940A100"/>
+  <w16cid:commentId w16cid:paraId="1AEF4160" w16cid:durableId="2D06587C"/>
+  <w16cid:commentId w16cid:paraId="5C9098B6" w16cid:durableId="4C2C3F5B"/>
   <w16cid:commentId w16cid:paraId="60EFF882" w16cid:durableId="1803F2CB"/>
   <w16cid:commentId w16cid:paraId="11847F66" w16cid:durableId="2CEF65EE"/>
   <w16cid:commentId w16cid:paraId="61CF42B2" w16cid:durableId="390A3A60"/>
-  <w16cid:commentId w16cid:paraId="535F35E9" w16cid:durableId="7E954B93"/>
+  <w16cid:commentId w16cid:paraId="457EC8E9" w16cid:durableId="285C1B87"/>
+  <w16cid:commentId w16cid:paraId="240AE705" w16cid:durableId="2526330B"/>
 </w16cid:commentsIds>
 </file>
 
@@ -4883,6 +6006,7 @@
   <w:style w:type="character" w:default="1" w:styleId="DefaultParagraphFont">
     <w:name w:val="Default Paragraph Font"/>
     <w:uiPriority w:val="1"/>
+    <w:semiHidden/>
     <w:unhideWhenUsed/>
   </w:style>
   <w:style w:type="table" w:default="1" w:styleId="TableNormal">
@@ -5639,4 +6763,16 @@
     </a:ext>
   </a:extLst>
 </a:theme>
+</file>
+
+<file path=customXml/item1.xml><?xml version="1.0" encoding="utf-8"?>
+<b:Sources xmlns:b="http://schemas.openxmlformats.org/officeDocument/2006/bibliography" xmlns="http://schemas.openxmlformats.org/officeDocument/2006/bibliography" SelectedStyle="\APASixthEditionOfficeOnline.xsl" StyleName="APA" Version="6"/>
+</file>
+
+<file path=customXml/itemProps1.xml><?xml version="1.0" encoding="utf-8"?>
+<ds:datastoreItem xmlns:ds="http://schemas.openxmlformats.org/officeDocument/2006/customXml" ds:itemID="{6B66AE4D-B9CA-4F02-9CD6-274F100AABAF}">
+  <ds:schemaRefs>
+    <ds:schemaRef ds:uri="http://schemas.openxmlformats.org/officeDocument/2006/bibliography"/>
+  </ds:schemaRefs>
+</ds:datastoreItem>
 </file>
</xml_diff>

<commit_message>
goes with previous commit. look over your writing and suggestions and make small edits.
</commit_message>
<xml_diff>
--- a/Manuscript draft.docx
+++ b/Manuscript draft.docx
@@ -2012,7 +2012,31 @@
                 <w:rPr>
                   <w:rFonts w:ascii="Cambria Math" w:eastAsiaTheme="minorEastAsia" w:hAnsi="Cambria Math"/>
                 </w:rPr>
-                <m:t>i,j,k</m:t>
+                <m:t>i</m:t>
+              </m:r>
+              <m:r>
+                <w:rPr>
+                  <w:rFonts w:ascii="Cambria Math" w:eastAsiaTheme="minorEastAsia" w:hAnsi="Cambria Math"/>
+                </w:rPr>
+                <m:t>,</m:t>
+              </m:r>
+              <m:r>
+                <w:rPr>
+                  <w:rFonts w:ascii="Cambria Math" w:eastAsiaTheme="minorEastAsia" w:hAnsi="Cambria Math"/>
+                </w:rPr>
+                <m:t>j</m:t>
+              </m:r>
+              <m:r>
+                <w:rPr>
+                  <w:rFonts w:ascii="Cambria Math" w:eastAsiaTheme="minorEastAsia" w:hAnsi="Cambria Math"/>
+                </w:rPr>
+                <m:t>,</m:t>
+              </m:r>
+              <m:r>
+                <w:rPr>
+                  <w:rFonts w:ascii="Cambria Math" w:eastAsiaTheme="minorEastAsia" w:hAnsi="Cambria Math"/>
+                </w:rPr>
+                <m:t>k</m:t>
               </m:r>
             </m:sub>
           </m:sSub>
@@ -2020,7 +2044,13 @@
             <w:rPr>
               <w:rFonts w:ascii="Cambria Math" w:eastAsiaTheme="minorEastAsia" w:hAnsi="Cambria Math"/>
             </w:rPr>
-            <m:t> ~ NB</m:t>
+            <m:t xml:space="preserve"> ~ </m:t>
+          </m:r>
+          <m:r>
+            <w:rPr>
+              <w:rFonts w:ascii="Cambria Math" w:eastAsiaTheme="minorEastAsia" w:hAnsi="Cambria Math"/>
+            </w:rPr>
+            <m:t>NB</m:t>
           </m:r>
           <m:d>
             <m:dPr>
@@ -2052,7 +2082,31 @@
                     <w:rPr>
                       <w:rFonts w:ascii="Cambria Math" w:eastAsiaTheme="minorEastAsia" w:hAnsi="Cambria Math"/>
                     </w:rPr>
-                    <m:t>i,j,k</m:t>
+                    <m:t>i</m:t>
+                  </m:r>
+                  <m:r>
+                    <w:rPr>
+                      <w:rFonts w:ascii="Cambria Math" w:eastAsiaTheme="minorEastAsia" w:hAnsi="Cambria Math"/>
+                    </w:rPr>
+                    <m:t>,</m:t>
+                  </m:r>
+                  <m:r>
+                    <w:rPr>
+                      <w:rFonts w:ascii="Cambria Math" w:eastAsiaTheme="minorEastAsia" w:hAnsi="Cambria Math"/>
+                    </w:rPr>
+                    <m:t>j</m:t>
+                  </m:r>
+                  <m:r>
+                    <w:rPr>
+                      <w:rFonts w:ascii="Cambria Math" w:eastAsiaTheme="minorEastAsia" w:hAnsi="Cambria Math"/>
+                    </w:rPr>
+                    <m:t>,</m:t>
+                  </m:r>
+                  <m:r>
+                    <w:rPr>
+                      <w:rFonts w:ascii="Cambria Math" w:eastAsiaTheme="minorEastAsia" w:hAnsi="Cambria Math"/>
+                    </w:rPr>
+                    <m:t>k</m:t>
                   </m:r>
                 </m:sub>
               </m:sSub>
@@ -2060,7 +2114,13 @@
                 <w:rPr>
                   <w:rFonts w:ascii="Cambria Math" w:eastAsiaTheme="minorEastAsia" w:hAnsi="Cambria Math"/>
                 </w:rPr>
-                <m:t>,ϕ</m:t>
+                <m:t>,</m:t>
+              </m:r>
+              <m:r>
+                <w:rPr>
+                  <w:rFonts w:ascii="Cambria Math" w:eastAsiaTheme="minorEastAsia" w:hAnsi="Cambria Math"/>
+                </w:rPr>
+                <m:t>ϕ</m:t>
               </m:r>
             </m:e>
           </m:d>
@@ -3135,7 +3195,13 @@
             <w:rPr>
               <w:rFonts w:ascii="Cambria Math" w:eastAsiaTheme="minorEastAsia" w:hAnsi="Cambria Math"/>
             </w:rPr>
-            <m:t> ~ Normal</m:t>
+            <m:t xml:space="preserve"> ~ </m:t>
+          </m:r>
+          <m:r>
+            <w:rPr>
+              <w:rFonts w:ascii="Cambria Math" w:eastAsiaTheme="minorEastAsia" w:hAnsi="Cambria Math"/>
+            </w:rPr>
+            <m:t>Normal</m:t>
           </m:r>
           <m:d>
             <m:dPr>
@@ -6717,7 +6783,19 @@
     </w16cex:extLst>
   </w16cex:commentExtensible>
   <w16cex:commentExtensible w16cex:durableId="285C1B87" w16cex:dateUtc="2026-09-07T19:33:00Z"/>
-  <w16cex:commentExtensible w16cex:durableId="2DB46F20" w16cex:dateUtc="2026-09-09T22:01:00Z"/>
+  <w16cex:commentExtensible w16cex:durableId="2DB46F20" w16cex:dateUtc="2026-09-09T22:01:00Z">
+    <w16cex:extLst>
+      <w16:ext w16:uri="{CE6994B0-6A32-4C9F-8C6B-6E91EDA988CE}">
+        <cr:reactions xmlns:cr="http://schemas.microsoft.com/office/comments/2020/reactions">
+          <cr:reaction reactionType="1">
+            <cr:reactionInfo dateUtc="2026-09-23T23:09:57Z">
+              <cr:user userId="S::mccloskw@oregonstate.edu::b1990487-ee44-4922-b58f-5b2980a02730" userProvider="AD" userName="McCloskey, Ross"/>
+            </cr:reactionInfo>
+          </cr:reaction>
+        </cr:reactions>
+      </w16:ext>
+    </w16cex:extLst>
+  </w16cex:commentExtensible>
   <w16cex:commentExtensible w16cex:durableId="2526330B" w16cex:dateUtc="2026-09-07T20:29:00Z"/>
 </w16cex:commentsExtensible>
 </file>
@@ -7356,6 +7434,7 @@
   <w:style w:type="character" w:default="1" w:styleId="DefaultParagraphFont">
     <w:name w:val="Default Paragraph Font"/>
     <w:uiPriority w:val="1"/>
+    <w:semiHidden/>
     <w:unhideWhenUsed/>
   </w:style>
   <w:style w:type="table" w:default="1" w:styleId="TableNormal">

</xml_diff>

<commit_message>
Accept staged edits and correct some formatting.
</commit_message>
<xml_diff>
--- a/Manuscript draft.docx
+++ b/Manuscript draft.docx
@@ -441,11 +441,11 @@
         <w:t xml:space="preserve">, </w:t>
       </w:r>
       <w:r>
-        <w:t xml:space="preserve">less attention has been paid to fine-scale spatiotemporal and environmental factors that may </w:t>
+        <w:t>less attention has been paid to fine-scale spatiotemporal and environmental factors that may</w:t>
       </w:r>
       <w:del w:id="4" w:author="McCloskey, Ross" w:date="2026-09-23T15:28:00Z" w16du:dateUtc="2026-09-23T22:28:00Z">
         <w:r>
-          <w:delText xml:space="preserve">have </w:delText>
+          <w:delText xml:space="preserve"> </w:delText>
         </w:r>
       </w:del>
       <w:r>
@@ -1138,23 +1138,16 @@
       <w:r>
         <w:t>. Mean depth, temperature, and salinity during each net tow was calculated (Fig</w:t>
       </w:r>
-      <w:ins w:id="7" w:author="McCloskey, Ross" w:date="2026-09-23T15:33:00Z" w16du:dateUtc="2026-09-23T22:33:00Z">
-        <w:r>
-          <w:t>ure</w:t>
-        </w:r>
-      </w:ins>
-      <w:del w:id="8" w:author="McCloskey, Ross" w:date="2026-09-23T15:33:00Z" w16du:dateUtc="2026-09-23T22:33:00Z">
-        <w:r>
-          <w:delText>.</w:delText>
-        </w:r>
-      </w:del>
+      <w:r>
+        <w:t>ure</w:t>
+      </w:r>
       <w:r>
         <w:t xml:space="preserve"> 1B–C)</w:t>
       </w:r>
       <w:r>
         <w:t>. Upon retrieval of the MOCNESS, bulk plankton samples were preserved in 95% ethanol. All ichthyoplankton were then visually identified to the finest possible taxonomic resolution (usually genus- or species-level) and counted.</w:t>
       </w:r>
-      <w:ins w:id="9" w:author="Bobay, Luke Andrew" w:date="2026-09-09T08:49:00Z" w16du:dateUtc="2026-09-09T15:49:00Z">
+      <w:ins w:id="7" w:author="Bobay, Luke Andrew" w:date="2026-09-09T08:49:00Z" w16du:dateUtc="2026-09-09T15:49:00Z">
         <w:r>
           <w:t xml:space="preserve"> </w:t>
         </w:r>
@@ -1275,18 +1268,11 @@
       <w:r>
         <w:t xml:space="preserve"> (Fig</w:t>
       </w:r>
-      <w:ins w:id="10" w:author="McCloskey, Ross" w:date="2026-09-23T15:35:00Z" w16du:dateUtc="2026-09-23T22:35:00Z">
-        <w:r>
-          <w:t>ure</w:t>
-        </w:r>
-      </w:ins>
-      <w:del w:id="11" w:author="McCloskey, Ross" w:date="2026-09-23T15:35:00Z" w16du:dateUtc="2026-09-23T22:35:00Z">
-        <w:r>
-          <w:delText>.</w:delText>
-        </w:r>
-      </w:del>
-      <w:r>
-        <w:t xml:space="preserve"> 1D)</w:t>
+      <w:r>
+        <w:t xml:space="preserve">ure </w:t>
+      </w:r>
+      <w:r>
+        <w:t>1D)</w:t>
       </w:r>
       <w:r>
         <w:t>. Mean chl-</w:t>
@@ -1317,16 +1303,9 @@
       <w:r>
         <w:t xml:space="preserve"> (Fig</w:t>
       </w:r>
-      <w:ins w:id="12" w:author="McCloskey, Ross" w:date="2026-09-23T15:35:00Z" w16du:dateUtc="2026-09-23T22:35:00Z">
-        <w:r>
-          <w:t>ure</w:t>
-        </w:r>
-      </w:ins>
-      <w:del w:id="13" w:author="McCloskey, Ross" w:date="2026-09-23T15:35:00Z" w16du:dateUtc="2026-09-23T22:35:00Z">
-        <w:r>
-          <w:delText>.</w:delText>
-        </w:r>
-      </w:del>
+      <w:r>
+        <w:t>ure</w:t>
+      </w:r>
       <w:r>
         <w:t xml:space="preserve"> 1E)</w:t>
       </w:r>
@@ -1368,7 +1347,6 @@
         <w:pStyle w:val="Heading2"/>
       </w:pPr>
       <w:r>
-        <w:lastRenderedPageBreak/>
         <w:t>2.2</w:t>
       </w:r>
       <w:r>
@@ -1387,11 +1365,15 @@
     <w:p>
       <w:pPr>
         <w:rPr>
-          <w:del w:id="14" w:author="Bobay, Luke Andrew" w:date="2026-09-09T09:01:00Z" w16du:dateUtc="2026-09-09T16:01:00Z"/>
+          <w:del w:id="8" w:author="Bobay, Luke Andrew" w:date="2026-09-09T09:01:00Z" w16du:dateUtc="2026-09-09T16:01:00Z"/>
         </w:rPr>
       </w:pPr>
       <w:r>
-        <w:t>Because some genera and species were rare, could only be identified to the family level (either because they were morphologically similar to co-occurring taxa or specimens were often damaged), or were considered very ecologically similar (</w:t>
+        <w:t xml:space="preserve">Because some genera and species were rare, could only be identified to the family level (either because they were morphologically similar to co-occurring taxa or specimens were often </w:t>
+      </w:r>
+      <w:r>
+        <w:lastRenderedPageBreak/>
+        <w:t>damaged), or were considered very ecologically similar (</w:t>
       </w:r>
       <w:r>
         <w:rPr>
@@ -1453,11 +1435,14 @@
     </w:p>
     <w:p>
       <w:pPr>
-        <w:rPr>
-          <w:i/>
-          <w:iCs/>
-        </w:rPr>
+        <w:pStyle w:val="Heading3"/>
       </w:pPr>
+      <w:r>
+        <w:t>2.2.1</w:t>
+      </w:r>
+      <w:r>
+        <w:tab/>
+      </w:r>
       <w:r>
         <w:rPr>
           <w:i/>
@@ -1554,16 +1539,9 @@
       <w:r>
         <w:t>using average linkage (Fig</w:t>
       </w:r>
-      <w:ins w:id="15" w:author="McCloskey, Ross" w:date="2026-09-23T15:38:00Z" w16du:dateUtc="2026-09-23T22:38:00Z">
-        <w:r>
-          <w:t>ure</w:t>
-        </w:r>
-      </w:ins>
-      <w:del w:id="16" w:author="McCloskey, Ross" w:date="2026-09-23T15:38:00Z" w16du:dateUtc="2026-09-23T22:38:00Z">
-        <w:r>
-          <w:delText>.</w:delText>
-        </w:r>
-      </w:del>
+      <w:r>
+        <w:t>ure</w:t>
+      </w:r>
       <w:r>
         <w:t xml:space="preserve"> S1)</w:t>
       </w:r>
@@ -1588,11 +1566,6 @@
       <w:r>
         <w:t>, which were interpreted as representing ecologically meaningful differences among clusters</w:t>
       </w:r>
-      <w:del w:id="17" w:author="McCloskey, Ross" w:date="2026-09-23T15:40:00Z" w16du:dateUtc="2026-09-23T22:40:00Z">
-        <w:r>
-          <w:delText>.</w:delText>
-        </w:r>
-      </w:del>
       <w:r>
         <w:t xml:space="preserve">. </w:t>
       </w:r>
@@ -1644,18 +1617,18 @@
       <w:r>
         <w:t>(</w:t>
       </w:r>
-      <w:commentRangeStart w:id="18"/>
+      <w:commentRangeStart w:id="9"/>
       <w:r>
         <w:t>NMDS</w:t>
       </w:r>
-      <w:commentRangeEnd w:id="18"/>
+      <w:commentRangeEnd w:id="9"/>
       <w:r>
         <w:rPr>
           <w:rStyle w:val="CommentReference"/>
           <w:sz w:val="24"/>
           <w:szCs w:val="24"/>
         </w:rPr>
-        <w:commentReference w:id="18"/>
+        <w:commentReference w:id="9"/>
       </w:r>
       <w:r>
         <w:t>)</w:t>
@@ -1814,12 +1787,10 @@
       <w:r>
         <w:fldChar w:fldCharType="end"/>
       </w:r>
-      <w:ins w:id="19" w:author="Bobay, Luke Andrew" w:date="2026-09-09T14:18:00Z" w16du:dateUtc="2026-09-09T21:18:00Z">
-        <w:r>
-          <w:t>.</w:t>
-        </w:r>
-      </w:ins>
-      <w:del w:id="20" w:author="Bobay, Luke Andrew" w:date="2026-09-09T14:06:00Z" w16du:dateUtc="2026-09-09T21:06:00Z">
+      <w:r>
+        <w:t>.</w:t>
+      </w:r>
+      <w:del w:id="10" w:author="Bobay, Luke Andrew" w:date="2026-09-09T14:06:00Z" w16du:dateUtc="2026-09-09T21:06:00Z">
         <w:r>
           <w:delText xml:space="preserve"> </w:delText>
         </w:r>
@@ -1832,11 +1803,14 @@
     </w:p>
     <w:p>
       <w:pPr>
-        <w:rPr>
-          <w:i/>
-          <w:iCs/>
-        </w:rPr>
+        <w:pStyle w:val="Heading3"/>
       </w:pPr>
+      <w:r>
+        <w:t>2.2.2</w:t>
+      </w:r>
+      <w:r>
+        <w:tab/>
+      </w:r>
       <w:r>
         <w:rPr>
           <w:i/>
@@ -1872,42 +1846,42 @@
         <w:t>a</w:t>
       </w:r>
       <w:r>
-        <w:t xml:space="preserve">, as well as a </w:t>
+        <w:t xml:space="preserve">, as well as a spatiotemporal base model, including effects of year, time of day, latitude, net tow depth, and seafloor depth, were fit. </w:t>
+      </w:r>
+      <w:r>
+        <w:t xml:space="preserve">Raw and adjusted </w:t>
+      </w:r>
+      <w:r>
+        <w:rPr>
+          <w:i/>
+          <w:iCs/>
+        </w:rPr>
+        <w:t>R</w:t>
+      </w:r>
+      <w:r>
+        <w:rPr>
+          <w:vertAlign w:val="superscript"/>
+        </w:rPr>
+        <w:t>2</w:t>
+      </w:r>
+      <w:r>
+        <w:t xml:space="preserve"> was calculated for each model. </w:t>
+      </w:r>
+      <w:r>
+        <w:t>Permutation-based ANOVA tests for constrained ordination models with 999 permutation</w:t>
+      </w:r>
+      <w:r>
+        <w:t>s</w:t>
+      </w:r>
+      <w:r>
+        <w:t xml:space="preserve"> were used to assess the significance of the variation explained by the spatiotemporal and full dbRDA models. The</w:t>
+      </w:r>
+      <w:r>
+        <w:t xml:space="preserve"> </w:t>
       </w:r>
       <w:r>
         <w:lastRenderedPageBreak/>
-        <w:t xml:space="preserve">spatiotemporal base model, including effects of year, time of day, latitude, net tow depth, and seafloor depth, were fit. </w:t>
-      </w:r>
-      <w:r>
-        <w:t xml:space="preserve">Raw and adjusted </w:t>
-      </w:r>
-      <w:r>
-        <w:rPr>
-          <w:i/>
-          <w:iCs/>
-        </w:rPr>
-        <w:t>R</w:t>
-      </w:r>
-      <w:r>
-        <w:rPr>
-          <w:vertAlign w:val="superscript"/>
-        </w:rPr>
-        <w:t>2</w:t>
-      </w:r>
-      <w:r>
-        <w:t xml:space="preserve"> was calculated for each model. </w:t>
-      </w:r>
-      <w:r>
-        <w:t>Permutation-based ANOVA tests for constrained ordination models with 999 permutation</w:t>
-      </w:r>
-      <w:r>
-        <w:t>s</w:t>
-      </w:r>
-      <w:r>
-        <w:t xml:space="preserve"> were used to assess the significance of the variation explained by the spatiotemporal and full dbRDA models. The</w:t>
-      </w:r>
-      <w:r>
-        <w:t xml:space="preserve"> significance of the</w:t>
+        <w:t>significance of the</w:t>
       </w:r>
       <w:r>
         <w:t xml:space="preserve"> additional variation explained by the environmental covariates was assessed using </w:t>
@@ -1918,11 +1892,18 @@
     </w:p>
     <w:p>
       <w:pPr>
+        <w:pStyle w:val="Heading3"/>
         <w:rPr>
           <w:i/>
           <w:iCs/>
         </w:rPr>
       </w:pPr>
+      <w:r>
+        <w:t>2.2.3</w:t>
+      </w:r>
+      <w:r>
+        <w:tab/>
+      </w:r>
       <w:r>
         <w:rPr>
           <w:i/>
@@ -2012,31 +1993,7 @@
                 <w:rPr>
                   <w:rFonts w:ascii="Cambria Math" w:eastAsiaTheme="minorEastAsia" w:hAnsi="Cambria Math"/>
                 </w:rPr>
-                <m:t>i</m:t>
-              </m:r>
-              <m:r>
-                <w:rPr>
-                  <w:rFonts w:ascii="Cambria Math" w:eastAsiaTheme="minorEastAsia" w:hAnsi="Cambria Math"/>
-                </w:rPr>
-                <m:t>,</m:t>
-              </m:r>
-              <m:r>
-                <w:rPr>
-                  <w:rFonts w:ascii="Cambria Math" w:eastAsiaTheme="minorEastAsia" w:hAnsi="Cambria Math"/>
-                </w:rPr>
-                <m:t>j</m:t>
-              </m:r>
-              <m:r>
-                <w:rPr>
-                  <w:rFonts w:ascii="Cambria Math" w:eastAsiaTheme="minorEastAsia" w:hAnsi="Cambria Math"/>
-                </w:rPr>
-                <m:t>,</m:t>
-              </m:r>
-              <m:r>
-                <w:rPr>
-                  <w:rFonts w:ascii="Cambria Math" w:eastAsiaTheme="minorEastAsia" w:hAnsi="Cambria Math"/>
-                </w:rPr>
-                <m:t>k</m:t>
+                <m:t>i,j,k</m:t>
               </m:r>
             </m:sub>
           </m:sSub>
@@ -2044,13 +2001,7 @@
             <w:rPr>
               <w:rFonts w:ascii="Cambria Math" w:eastAsiaTheme="minorEastAsia" w:hAnsi="Cambria Math"/>
             </w:rPr>
-            <m:t xml:space="preserve"> ~ </m:t>
-          </m:r>
-          <m:r>
-            <w:rPr>
-              <w:rFonts w:ascii="Cambria Math" w:eastAsiaTheme="minorEastAsia" w:hAnsi="Cambria Math"/>
-            </w:rPr>
-            <m:t>NB</m:t>
+            <m:t> ~ NB</m:t>
           </m:r>
           <m:d>
             <m:dPr>
@@ -2082,31 +2033,7 @@
                     <w:rPr>
                       <w:rFonts w:ascii="Cambria Math" w:eastAsiaTheme="minorEastAsia" w:hAnsi="Cambria Math"/>
                     </w:rPr>
-                    <m:t>i</m:t>
-                  </m:r>
-                  <m:r>
-                    <w:rPr>
-                      <w:rFonts w:ascii="Cambria Math" w:eastAsiaTheme="minorEastAsia" w:hAnsi="Cambria Math"/>
-                    </w:rPr>
-                    <m:t>,</m:t>
-                  </m:r>
-                  <m:r>
-                    <w:rPr>
-                      <w:rFonts w:ascii="Cambria Math" w:eastAsiaTheme="minorEastAsia" w:hAnsi="Cambria Math"/>
-                    </w:rPr>
-                    <m:t>j</m:t>
-                  </m:r>
-                  <m:r>
-                    <w:rPr>
-                      <w:rFonts w:ascii="Cambria Math" w:eastAsiaTheme="minorEastAsia" w:hAnsi="Cambria Math"/>
-                    </w:rPr>
-                    <m:t>,</m:t>
-                  </m:r>
-                  <m:r>
-                    <w:rPr>
-                      <w:rFonts w:ascii="Cambria Math" w:eastAsiaTheme="minorEastAsia" w:hAnsi="Cambria Math"/>
-                    </w:rPr>
-                    <m:t>k</m:t>
+                    <m:t>i,j,k</m:t>
                   </m:r>
                 </m:sub>
               </m:sSub>
@@ -2114,13 +2041,7 @@
                 <w:rPr>
                   <w:rFonts w:ascii="Cambria Math" w:eastAsiaTheme="minorEastAsia" w:hAnsi="Cambria Math"/>
                 </w:rPr>
-                <m:t>,</m:t>
-              </m:r>
-              <m:r>
-                <w:rPr>
-                  <w:rFonts w:ascii="Cambria Math" w:eastAsiaTheme="minorEastAsia" w:hAnsi="Cambria Math"/>
-                </w:rPr>
-                <m:t>ϕ</m:t>
+                <m:t>,ϕ</m:t>
               </m:r>
             </m:e>
           </m:d>
@@ -3195,13 +3116,7 @@
             <w:rPr>
               <w:rFonts w:ascii="Cambria Math" w:eastAsiaTheme="minorEastAsia" w:hAnsi="Cambria Math"/>
             </w:rPr>
-            <m:t xml:space="preserve"> ~ </m:t>
-          </m:r>
-          <m:r>
-            <w:rPr>
-              <w:rFonts w:ascii="Cambria Math" w:eastAsiaTheme="minorEastAsia" w:hAnsi="Cambria Math"/>
-            </w:rPr>
-            <m:t>Normal</m:t>
+            <m:t> ~ Normal</m:t>
           </m:r>
           <m:d>
             <m:dPr>
@@ -3353,7 +3268,7 @@
       <w:r>
         <w:t>each sample.</w:t>
       </w:r>
-      <w:ins w:id="21" w:author="Bobay, Luke Andrew" w:date="2026-08-29T00:39:00Z" w16du:dateUtc="2026-08-29T07:39:00Z">
+      <w:ins w:id="11" w:author="Bobay, Luke Andrew" w:date="2026-08-29T00:39:00Z" w16du:dateUtc="2026-08-29T07:39:00Z">
         <w:r>
           <w:t xml:space="preserve"> </w:t>
         </w:r>
@@ -3366,16 +3281,9 @@
       <w:r>
         <w:t xml:space="preserve"> (Fig</w:t>
       </w:r>
-      <w:ins w:id="22" w:author="McCloskey, Ross" w:date="2026-09-23T15:47:00Z" w16du:dateUtc="2026-09-23T22:47:00Z">
-        <w:r>
-          <w:t>ure</w:t>
-        </w:r>
-      </w:ins>
-      <w:del w:id="23" w:author="McCloskey, Ross" w:date="2026-09-23T15:47:00Z" w16du:dateUtc="2026-09-23T22:47:00Z">
-        <w:r>
-          <w:delText>.</w:delText>
-        </w:r>
-      </w:del>
+      <w:r>
+        <w:t>ure</w:t>
+      </w:r>
       <w:r>
         <w:t xml:space="preserve"> 6)</w:t>
       </w:r>
@@ -3403,16 +3311,9 @@
       <w:r>
         <w:t xml:space="preserve"> (Fig</w:t>
       </w:r>
-      <w:ins w:id="24" w:author="McCloskey, Ross" w:date="2026-09-23T15:47:00Z" w16du:dateUtc="2026-09-23T22:47:00Z">
-        <w:r>
-          <w:t>ure</w:t>
-        </w:r>
-      </w:ins>
-      <w:del w:id="25" w:author="McCloskey, Ross" w:date="2026-09-23T15:47:00Z" w16du:dateUtc="2026-09-23T22:47:00Z">
-        <w:r>
-          <w:delText>.</w:delText>
-        </w:r>
-      </w:del>
+      <w:r>
+        <w:t>ure</w:t>
+      </w:r>
       <w:r>
         <w:t xml:space="preserve"> 7)</w:t>
       </w:r>
@@ -3434,16 +3335,9 @@
       <w:r>
         <w:t xml:space="preserve"> (Fig</w:t>
       </w:r>
-      <w:ins w:id="26" w:author="McCloskey, Ross" w:date="2026-09-23T15:48:00Z" w16du:dateUtc="2026-09-23T22:48:00Z">
-        <w:r>
-          <w:t>ure</w:t>
-        </w:r>
-      </w:ins>
-      <w:del w:id="27" w:author="McCloskey, Ross" w:date="2026-09-23T15:48:00Z" w16du:dateUtc="2026-09-23T22:48:00Z">
-        <w:r>
-          <w:delText>.</w:delText>
-        </w:r>
-      </w:del>
+      <w:r>
+        <w:t>ure</w:t>
+      </w:r>
       <w:r>
         <w:t xml:space="preserve"> 8)</w:t>
       </w:r>
@@ -3455,7 +3349,7 @@
       <w:r>
         <w:t>All statistical analyses were conducted using R version 4.5.2 (</w:t>
       </w:r>
-      <w:commentRangeStart w:id="28"/>
+      <w:commentRangeStart w:id="12"/>
       <w:r>
         <w:t>R Core Team</w:t>
       </w:r>
@@ -3465,14 +3359,14 @@
       <w:r>
         <w:t xml:space="preserve"> 2025</w:t>
       </w:r>
-      <w:commentRangeEnd w:id="28"/>
+      <w:commentRangeEnd w:id="12"/>
       <w:r>
         <w:rPr>
           <w:rStyle w:val="CommentReference"/>
           <w:sz w:val="24"/>
           <w:szCs w:val="24"/>
         </w:rPr>
-        <w:commentReference w:id="28"/>
+        <w:commentReference w:id="12"/>
       </w:r>
       <w:r>
         <w:t xml:space="preserve">). </w:t>
@@ -3567,6 +3461,7 @@
         <w:pStyle w:val="Heading2"/>
       </w:pPr>
       <w:r>
+        <w:lastRenderedPageBreak/>
         <w:t>3.1</w:t>
       </w:r>
       <w:r>
@@ -3583,7 +3478,7 @@
       <w:r>
         <w:t>thresholding</w:t>
       </w:r>
-      <w:ins w:id="29" w:author="Bobay, Luke Andrew" w:date="2026-09-09T11:10:00Z" w16du:dateUtc="2026-09-09T18:10:00Z">
+      <w:ins w:id="13" w:author="Bobay, Luke Andrew" w:date="2026-09-09T11:10:00Z" w16du:dateUtc="2026-09-09T18:10:00Z">
         <w:r>
           <w:t>,</w:t>
         </w:r>
@@ -3745,16 +3640,10 @@
       </w:r>
     </w:p>
     <w:p>
-      <w:pPr>
-        <w:rPr>
-          <w:b/>
-          <w:bCs/>
-        </w:rPr>
-      </w:pPr>
       <w:r>
         <w:t>Cluster analysis of net tows yielded seven total clusters, two of which</w:t>
       </w:r>
-      <w:ins w:id="30" w:author="Bobay, Luke Andrew" w:date="2026-09-09T11:55:00Z" w16du:dateUtc="2026-09-09T18:55:00Z">
+      <w:ins w:id="14" w:author="Bobay, Luke Andrew" w:date="2026-09-09T11:55:00Z" w16du:dateUtc="2026-09-09T18:55:00Z">
         <w:r>
           <w:t xml:space="preserve"> </w:t>
         </w:r>
@@ -3762,7 +3651,7 @@
       <w:r>
         <w:t>—</w:t>
       </w:r>
-      <w:ins w:id="31" w:author="Bobay, Luke Andrew" w:date="2026-09-09T11:55:00Z" w16du:dateUtc="2026-09-09T18:55:00Z">
+      <w:ins w:id="15" w:author="Bobay, Luke Andrew" w:date="2026-09-09T11:55:00Z" w16du:dateUtc="2026-09-09T18:55:00Z">
         <w:r>
           <w:t xml:space="preserve"> </w:t>
         </w:r>
@@ -3770,7 +3659,7 @@
       <w:r>
         <w:t>clusters 4 and 7</w:t>
       </w:r>
-      <w:ins w:id="32" w:author="Bobay, Luke Andrew" w:date="2026-09-09T11:55:00Z" w16du:dateUtc="2026-09-09T18:55:00Z">
+      <w:ins w:id="16" w:author="Bobay, Luke Andrew" w:date="2026-09-09T11:55:00Z" w16du:dateUtc="2026-09-09T18:55:00Z">
         <w:r>
           <w:t xml:space="preserve"> </w:t>
         </w:r>
@@ -3778,7 +3667,7 @@
       <w:r>
         <w:t>—</w:t>
       </w:r>
-      <w:ins w:id="33" w:author="Bobay, Luke Andrew" w:date="2026-09-09T11:55:00Z" w16du:dateUtc="2026-09-09T18:55:00Z">
+      <w:ins w:id="17" w:author="Bobay, Luke Andrew" w:date="2026-09-09T11:55:00Z" w16du:dateUtc="2026-09-09T18:55:00Z">
         <w:r>
           <w:t xml:space="preserve"> </w:t>
         </w:r>
@@ -3877,9 +3766,9 @@
       <w:r>
         <w:t xml:space="preserve"> the indicator species </w:t>
       </w:r>
-      <w:commentRangeStart w:id="34"/>
-      <w:commentRangeStart w:id="35"/>
-      <w:commentRangeStart w:id="36"/>
+      <w:commentRangeStart w:id="18"/>
+      <w:commentRangeStart w:id="19"/>
+      <w:commentRangeStart w:id="20"/>
       <w:r>
         <w:rPr>
           <w:i/>
@@ -3907,32 +3796,32 @@
       <w:r>
         <w:t xml:space="preserve"> </w:t>
       </w:r>
-      <w:commentRangeEnd w:id="34"/>
+      <w:commentRangeEnd w:id="18"/>
       <w:r>
         <w:rPr>
           <w:rStyle w:val="CommentReference"/>
           <w:sz w:val="24"/>
           <w:szCs w:val="24"/>
         </w:rPr>
-        <w:commentReference w:id="34"/>
-      </w:r>
-      <w:commentRangeEnd w:id="35"/>
+        <w:commentReference w:id="18"/>
+      </w:r>
+      <w:commentRangeEnd w:id="19"/>
       <w:r>
         <w:rPr>
           <w:rStyle w:val="CommentReference"/>
           <w:sz w:val="24"/>
           <w:szCs w:val="24"/>
         </w:rPr>
-        <w:commentReference w:id="35"/>
-      </w:r>
-      <w:commentRangeEnd w:id="36"/>
+        <w:commentReference w:id="19"/>
+      </w:r>
+      <w:commentRangeEnd w:id="20"/>
       <w:r>
         <w:rPr>
           <w:rStyle w:val="CommentReference"/>
           <w:sz w:val="24"/>
           <w:szCs w:val="24"/>
         </w:rPr>
-        <w:commentReference w:id="36"/>
+        <w:commentReference w:id="20"/>
       </w:r>
       <w:r>
         <w:t>(</w:t>
@@ -4011,7 +3900,7 @@
       <w:r>
         <w:t xml:space="preserve"> over the shelf break</w:t>
       </w:r>
-      <w:ins w:id="37" w:author="McCloskey, Ross" w:date="2026-09-23T15:55:00Z" w16du:dateUtc="2026-09-23T22:55:00Z">
+      <w:ins w:id="21" w:author="McCloskey, Ross" w:date="2026-09-23T15:55:00Z" w16du:dateUtc="2026-09-23T22:55:00Z">
         <w:r>
           <w:t>,</w:t>
         </w:r>
@@ -4049,7 +3938,7 @@
       <w:r>
         <w:t xml:space="preserve"> 2022</w:t>
       </w:r>
-      <w:ins w:id="38" w:author="Bobay, Luke Andrew" w:date="2026-09-09T12:41:00Z" w16du:dateUtc="2026-09-09T19:41:00Z">
+      <w:ins w:id="22" w:author="Bobay, Luke Andrew" w:date="2026-09-09T12:41:00Z" w16du:dateUtc="2026-09-09T19:41:00Z">
         <w:r>
           <w:t>,</w:t>
         </w:r>
@@ -4101,7 +3990,7 @@
       <w:r>
         <w:t>,</w:t>
       </w:r>
-      <w:del w:id="39" w:author="McCloskey, Ross" w:date="2026-09-23T15:56:00Z" w16du:dateUtc="2026-09-23T22:56:00Z">
+      <w:del w:id="23" w:author="McCloskey, Ross" w:date="2026-09-23T15:56:00Z" w16du:dateUtc="2026-09-23T22:56:00Z">
         <w:r>
           <w:delText xml:space="preserve"> </w:delText>
         </w:r>
@@ -4147,384 +4036,146 @@
       </w:r>
     </w:p>
     <w:p>
-      <w:r>
-        <w:t xml:space="preserve"> </w:t>
-      </w:r>
-    </w:p>
-    <w:p>
-      <w:pPr>
-        <w:pStyle w:val="Heading2"/>
-        <w:rPr>
-          <w:rFonts w:eastAsiaTheme="minorHAnsi"/>
-          <w:b w:val="0"/>
-          <w:bCs w:val="0"/>
-          <w:color w:val="auto"/>
-        </w:rPr>
-      </w:pPr>
-      <w:r>
-        <w:rPr>
-          <w:rFonts w:eastAsiaTheme="minorHAnsi"/>
-          <w:b w:val="0"/>
-          <w:bCs w:val="0"/>
-          <w:color w:val="auto"/>
-        </w:rPr>
-        <w:lastRenderedPageBreak/>
-        <w:t xml:space="preserve">The NMDS ordination of ichthyoplankton samples </w:t>
-      </w:r>
-      <w:r>
-        <w:rPr>
-          <w:rFonts w:eastAsiaTheme="minorHAnsi"/>
-          <w:b w:val="0"/>
-          <w:bCs w:val="0"/>
-          <w:color w:val="auto"/>
-        </w:rPr>
-        <w:t>facilitated</w:t>
-      </w:r>
-      <w:r>
-        <w:rPr>
-          <w:rFonts w:eastAsiaTheme="minorHAnsi"/>
-          <w:b w:val="0"/>
-          <w:bCs w:val="0"/>
-          <w:color w:val="auto"/>
-        </w:rPr>
-        <w:t xml:space="preserve"> further visualization of variation in ichthyoplankton assemblage composition and </w:t>
-      </w:r>
-      <w:r>
-        <w:rPr>
-          <w:rFonts w:eastAsiaTheme="minorHAnsi"/>
-          <w:b w:val="0"/>
-          <w:bCs w:val="0"/>
-          <w:color w:val="auto"/>
-        </w:rPr>
-        <w:t>associations between assemblage composition and spatiotemporal factors</w:t>
-      </w:r>
-      <w:r>
-        <w:rPr>
-          <w:rFonts w:eastAsiaTheme="minorHAnsi"/>
-          <w:b w:val="0"/>
-          <w:bCs w:val="0"/>
-          <w:color w:val="auto"/>
-        </w:rPr>
-        <w:t xml:space="preserve"> (Figure 4). The observed two-dimensional NMDS stress value was 0.205, which was significantly lower than the stress values generated from 1000 constrained null assemblages using the iterative permutation approach of Dexter et al. </w:t>
-      </w:r>
-      <w:r>
-        <w:rPr>
-          <w:rFonts w:eastAsiaTheme="minorHAnsi"/>
-          <w:b w:val="0"/>
-          <w:bCs w:val="0"/>
-          <w:color w:val="auto"/>
-        </w:rPr>
-        <w:fldChar w:fldCharType="begin"/>
-      </w:r>
-      <w:r>
-        <w:rPr>
-          <w:rFonts w:eastAsiaTheme="minorHAnsi"/>
-          <w:b w:val="0"/>
-          <w:bCs w:val="0"/>
-          <w:color w:val="auto"/>
-        </w:rPr>
-        <w:instrText xml:space="preserve"> ADDIN ZOTERO_ITEM CSL_CITATION {"citationID":"ej7Fcghr","properties":{"unsorted":false,"formattedCitation":"(Dexter et al., 2018)","plainCitation":"(Dexter et al., 2018)","noteIndex":0},"citationItems":[{"id":51,"uris":["http://zotero.org/groups/6650714/items/CHFY2M5N"],"itemData":{"id":51,"type":"article-journal","abstract":"Nonmetric multidimensional scaling (NMDS) is a powerful statistical tool which enables complex multivariate data sets to be visualized in a reduced number of dimensions. Users typically evaluate the fit of an NMDS ordination via ordination “stress” (i.e., data distortion) against a commonly accepted set of heuristic guidelines. However, these guidelines do not account for the mathematical relationship which links ordination stress to sample size. Consequently, researchers working with large data sets may unnecessarily present ordinations in an intractable number of dimensions, subdivide their data, or forego the use of NMDS entirely and lose the benefits of this highly flexible and useful technique. In order to overcome the limitations of these practices, we advocate for an alternative approach to the evaluation of NMDS ordination fit via the usage of permutation-based ecological null models. We present the rationale for this approach from a theoretical basis, supported by a brief literature review, and an example usage of the methodology. Our literature review shows that NMDS analyses often far exceed the number of observations under which the original stress guidelines were formulated—with a significant increasing trend in recent decades. Adoption of a permutation-based approach will consequently provide a more flexible and quantitative evaluation of NMDS fit and allow for the continued application of NMDS in an era of increasingly large datasets.","container-title":"Limnology and Oceanography: Methods","DOI":"10.1002/lom3.10257","ISSN":"1541-5856","issue":"7","language":"en","page":"434-443","source":"Wiley Online Library","title":"The trouble with stress: A flexible method for the evaluation of nonmetric multidimensional scaling","title-short":"The trouble with stress","volume":"16","author":[{"family":"Dexter","given":"Eric"},{"family":"Rollwagen-Bollens","given":"Gretchen"},{"family":"Bollens","given":"Stephen M."}],"issued":{"date-parts":[["2018"]]}}}],"schema":"https://github.com/citation-style-language/schema/raw/master/csl-citation.json"} </w:instrText>
-      </w:r>
-      <w:r>
-        <w:rPr>
-          <w:rFonts w:eastAsiaTheme="minorHAnsi"/>
-          <w:b w:val="0"/>
-          <w:bCs w:val="0"/>
-          <w:color w:val="auto"/>
-        </w:rPr>
-        <w:fldChar w:fldCharType="separate"/>
-      </w:r>
-      <w:r>
-        <w:rPr>
-          <w:b w:val="0"/>
-          <w:bCs w:val="0"/>
-        </w:rPr>
-        <w:t>(2018)</w:t>
-      </w:r>
-      <w:r>
-        <w:rPr>
-          <w:rFonts w:eastAsiaTheme="minorHAnsi"/>
-          <w:b w:val="0"/>
-          <w:bCs w:val="0"/>
-          <w:color w:val="auto"/>
-        </w:rPr>
-        <w:fldChar w:fldCharType="end"/>
-      </w:r>
-      <w:r>
-        <w:rPr>
-          <w:rFonts w:eastAsiaTheme="minorHAnsi"/>
-          <w:b w:val="0"/>
-          <w:bCs w:val="0"/>
-          <w:color w:val="auto"/>
-        </w:rPr>
-        <w:t xml:space="preserve"> (null mean = 0.282, </w:t>
-      </w:r>
-      <w:r>
-        <w:rPr>
-          <w:rFonts w:eastAsiaTheme="minorHAnsi"/>
-          <w:b w:val="0"/>
-          <w:bCs w:val="0"/>
-          <w:i/>
-          <w:iCs/>
-          <w:color w:val="auto"/>
-        </w:rPr>
-        <w:t xml:space="preserve">z </w:t>
-      </w:r>
-      <w:r>
-        <w:rPr>
-          <w:rFonts w:eastAsiaTheme="minorHAnsi"/>
-          <w:b w:val="0"/>
-          <w:bCs w:val="0"/>
-          <w:color w:val="auto"/>
-        </w:rPr>
-        <w:t xml:space="preserve">= -14.95, </w:t>
-      </w:r>
-      <w:r>
-        <w:rPr>
-          <w:rFonts w:eastAsiaTheme="minorHAnsi"/>
-          <w:b w:val="0"/>
-          <w:bCs w:val="0"/>
-          <w:i/>
-          <w:iCs/>
-          <w:color w:val="auto"/>
-        </w:rPr>
-        <w:t>p</w:t>
-      </w:r>
-      <w:r>
-        <w:rPr>
-          <w:rFonts w:eastAsiaTheme="minorHAnsi"/>
-          <w:b w:val="0"/>
-          <w:bCs w:val="0"/>
-          <w:color w:val="auto"/>
-        </w:rPr>
-        <w:t xml:space="preserve"> &lt; 0.001). Therefore, the NMDS ordination represented structure in the observed dissimilarity matrix better than expected under the null model</w:t>
-      </w:r>
-      <w:r>
-        <w:rPr>
-          <w:rFonts w:eastAsiaTheme="minorHAnsi"/>
-          <w:b w:val="0"/>
-          <w:bCs w:val="0"/>
-          <w:color w:val="auto"/>
-        </w:rPr>
-        <w:t>.</w:t>
-      </w:r>
-      <w:r>
-        <w:rPr>
-          <w:rFonts w:eastAsiaTheme="minorHAnsi"/>
-          <w:b w:val="0"/>
-          <w:bCs w:val="0"/>
-          <w:color w:val="auto"/>
-        </w:rPr>
-        <w:t xml:space="preserve"> </w:t>
-      </w:r>
-      <w:r>
-        <w:rPr>
-          <w:rFonts w:eastAsiaTheme="minorHAnsi"/>
-          <w:b w:val="0"/>
-          <w:bCs w:val="0"/>
-          <w:color w:val="auto"/>
-        </w:rPr>
-        <w:t>Overall, t</w:t>
-      </w:r>
-      <w:r>
-        <w:rPr>
-          <w:rFonts w:eastAsiaTheme="minorHAnsi"/>
-          <w:b w:val="0"/>
-          <w:bCs w:val="0"/>
-          <w:color w:val="auto"/>
-        </w:rPr>
-        <w:t>he NMDS ordination indicates that</w:t>
-      </w:r>
-      <w:r>
-        <w:rPr>
-          <w:rFonts w:eastAsiaTheme="minorHAnsi"/>
-          <w:b w:val="0"/>
-          <w:bCs w:val="0"/>
-          <w:color w:val="auto"/>
-        </w:rPr>
-        <w:t xml:space="preserve"> assemblages assigned to cluster 6 were more similar in composition to those assigned to cluster 2 than to other clusters (Figure 4). Assemblages assigned to </w:t>
-      </w:r>
-      <w:r>
-        <w:rPr>
-          <w:rFonts w:eastAsiaTheme="minorHAnsi"/>
-          <w:b w:val="0"/>
-          <w:bCs w:val="0"/>
-          <w:color w:val="auto"/>
-        </w:rPr>
-        <w:t xml:space="preserve">cluster 1 </w:t>
-      </w:r>
-      <w:r>
-        <w:rPr>
-          <w:rFonts w:eastAsiaTheme="minorHAnsi"/>
-          <w:b w:val="0"/>
-          <w:bCs w:val="0"/>
-          <w:color w:val="auto"/>
-        </w:rPr>
-        <w:t>tended to occur</w:t>
-      </w:r>
-      <w:r>
-        <w:rPr>
-          <w:rFonts w:eastAsiaTheme="minorHAnsi"/>
-          <w:b w:val="0"/>
-          <w:bCs w:val="0"/>
-          <w:color w:val="auto"/>
-        </w:rPr>
-        <w:t xml:space="preserve"> at intermediate seafloor depths, while cluster 3 occurred at greater seafloor depths and clusters 2</w:t>
-      </w:r>
-      <w:r>
-        <w:rPr>
-          <w:rFonts w:eastAsiaTheme="minorHAnsi"/>
-          <w:b w:val="0"/>
-          <w:bCs w:val="0"/>
-          <w:color w:val="auto"/>
-        </w:rPr>
-        <w:t>, 5,</w:t>
-      </w:r>
-      <w:r>
-        <w:rPr>
-          <w:rFonts w:eastAsiaTheme="minorHAnsi"/>
-          <w:b w:val="0"/>
-          <w:bCs w:val="0"/>
-          <w:color w:val="auto"/>
-        </w:rPr>
-        <w:t xml:space="preserve"> and 6 occurred at shallower seafloor depths</w:t>
-      </w:r>
-      <w:r>
-        <w:rPr>
-          <w:rFonts w:eastAsiaTheme="minorHAnsi"/>
-          <w:b w:val="0"/>
-          <w:bCs w:val="0"/>
-          <w:color w:val="auto"/>
-        </w:rPr>
-        <w:t xml:space="preserve"> (Figure 4)</w:t>
-      </w:r>
-      <w:r>
-        <w:rPr>
-          <w:rFonts w:eastAsiaTheme="minorHAnsi"/>
-          <w:b w:val="0"/>
-          <w:bCs w:val="0"/>
-          <w:color w:val="auto"/>
-        </w:rPr>
-        <w:t xml:space="preserve">. </w:t>
-      </w:r>
-      <w:r>
-        <w:rPr>
-          <w:rFonts w:eastAsiaTheme="minorHAnsi"/>
-          <w:b w:val="0"/>
-          <w:bCs w:val="0"/>
-          <w:color w:val="auto"/>
-        </w:rPr>
-        <w:t>Similarly</w:t>
-      </w:r>
-      <w:r>
-        <w:rPr>
-          <w:rFonts w:eastAsiaTheme="minorHAnsi"/>
-          <w:b w:val="0"/>
-          <w:bCs w:val="0"/>
-          <w:color w:val="auto"/>
-        </w:rPr>
-        <w:t xml:space="preserve">, </w:t>
-      </w:r>
-      <w:r>
-        <w:rPr>
-          <w:rFonts w:eastAsiaTheme="minorHAnsi"/>
-          <w:b w:val="0"/>
-          <w:bCs w:val="0"/>
-          <w:color w:val="auto"/>
-        </w:rPr>
-        <w:t>assemblages assigned to clusters 3 and 5 tended to occur at the greatest net tow depths</w:t>
-      </w:r>
-      <w:r>
-        <w:rPr>
-          <w:rFonts w:eastAsiaTheme="minorHAnsi"/>
-          <w:b w:val="0"/>
-          <w:bCs w:val="0"/>
-          <w:color w:val="auto"/>
-        </w:rPr>
-        <w:t xml:space="preserve"> (Figure 4)</w:t>
-      </w:r>
-      <w:r>
-        <w:rPr>
-          <w:rFonts w:eastAsiaTheme="minorHAnsi"/>
-          <w:b w:val="0"/>
-          <w:bCs w:val="0"/>
-          <w:color w:val="auto"/>
-        </w:rPr>
-        <w:t>.</w:t>
-      </w:r>
-      <w:r>
-        <w:rPr>
-          <w:rFonts w:eastAsiaTheme="minorHAnsi"/>
-          <w:b w:val="0"/>
-          <w:bCs w:val="0"/>
-          <w:color w:val="auto"/>
-        </w:rPr>
-        <w:t xml:space="preserve"> </w:t>
-      </w:r>
-      <w:r>
-        <w:rPr>
-          <w:rFonts w:eastAsiaTheme="minorHAnsi"/>
-          <w:b w:val="0"/>
-          <w:bCs w:val="0"/>
-          <w:color w:val="auto"/>
-        </w:rPr>
-        <w:t>Assemblages assigned to cluster 5 tended to occur during the daytime</w:t>
-      </w:r>
-      <w:r>
-        <w:rPr>
-          <w:rFonts w:eastAsiaTheme="minorHAnsi"/>
-          <w:b w:val="0"/>
-          <w:bCs w:val="0"/>
-          <w:color w:val="auto"/>
-        </w:rPr>
-        <w:t xml:space="preserve"> (Figure 4)</w:t>
-      </w:r>
-      <w:r>
-        <w:rPr>
-          <w:rFonts w:eastAsiaTheme="minorHAnsi"/>
-          <w:b w:val="0"/>
-          <w:bCs w:val="0"/>
-          <w:color w:val="auto"/>
-        </w:rPr>
-        <w:t>. Cluster 6 tended to occur at high latitudes, while clusters 3 and 5 tended to occur at lower latitudes</w:t>
-      </w:r>
-      <w:r>
-        <w:rPr>
-          <w:rFonts w:eastAsiaTheme="minorHAnsi"/>
-          <w:b w:val="0"/>
-          <w:bCs w:val="0"/>
-          <w:color w:val="auto"/>
-        </w:rPr>
-        <w:t xml:space="preserve"> (Figure 4)</w:t>
-      </w:r>
-      <w:r>
-        <w:rPr>
-          <w:rFonts w:eastAsiaTheme="minorHAnsi"/>
-          <w:b w:val="0"/>
-          <w:bCs w:val="0"/>
-          <w:color w:val="auto"/>
-        </w:rPr>
-        <w:t>.</w:t>
-      </w:r>
-    </w:p>
-    <w:p>
-      <w:pPr>
-        <w:pStyle w:val="Heading2"/>
-        <w:rPr>
-          <w:rFonts w:eastAsiaTheme="minorHAnsi"/>
-          <w:b w:val="0"/>
-          <w:bCs w:val="0"/>
-          <w:color w:val="auto"/>
-        </w:rPr>
-      </w:pPr>
-    </w:p>
-    <w:p>
       <w:pPr>
         <w:rPr>
           <w:b/>
           <w:bCs/>
         </w:rPr>
       </w:pPr>
+      <w:r>
+        <w:t xml:space="preserve">The NMDS ordination of ichthyoplankton samples </w:t>
+      </w:r>
+      <w:r>
+        <w:t>facilitated</w:t>
+      </w:r>
+      <w:r>
+        <w:t xml:space="preserve"> further visualization of variation in ichthyoplankton assemblage composition and </w:t>
+      </w:r>
+      <w:r>
+        <w:t>associations between assemblage composition and spatiotemporal factors</w:t>
+      </w:r>
+      <w:r>
+        <w:t xml:space="preserve"> (Figure 4). The observed two-dimensional NMDS stress value was 0.205, which was significantly lower than the stress values generated from 1000 constrained null assemblages using the iterative permutation approach of Dexter et al. </w:t>
+      </w:r>
+      <w:r>
+        <w:rPr>
+          <w:b/>
+          <w:bCs/>
+        </w:rPr>
+        <w:fldChar w:fldCharType="begin"/>
+      </w:r>
+      <w:r>
+        <w:instrText xml:space="preserve"> ADDIN ZOTERO_ITEM CSL_CITATION {"citationID":"ej7Fcghr","properties":{"unsorted":false,"formattedCitation":"(Dexter et al., 2018)","plainCitation":"(Dexter et al., 2018)","noteIndex":0},"citationItems":[{"id":51,"uris":["http://zotero.org/groups/6650714/items/CHFY2M5N"],"itemData":{"id":51,"type":"article-journal","abstract":"Nonmetric multidimensional scaling (NMDS) is a powerful statistical tool which enables complex multivariate data sets to be visualized in a reduced number of dimensions. Users typically evaluate the fit of an NMDS ordination via ordination “stress” (i.e., data distortion) against a commonly accepted set of heuristic guidelines. However, these guidelines do not account for the mathematical relationship which links ordination stress to sample size. Consequently, researchers working with large data sets may unnecessarily present ordinations in an intractable number of dimensions, subdivide their data, or forego the use of NMDS entirely and lose the benefits of this highly flexible and useful technique. In order to overcome the limitations of these practices, we advocate for an alternative approach to the evaluation of NMDS ordination fit via the usage of permutation-based ecological null models. We present the rationale for this approach from a theoretical basis, supported by a brief literature review, and an example usage of the methodology. Our literature review shows that NMDS analyses often far exceed the number of observations under which the original stress guidelines were formulated—with a significant increasing trend in recent decades. Adoption of a permutation-based approach will consequently provide a more flexible and quantitative evaluation of NMDS fit and allow for the continued application of NMDS in an era of increasingly large datasets.","container-title":"Limnology and Oceanography: Methods","DOI":"10.1002/lom3.10257","ISSN":"1541-5856","issue":"7","language":"en","page":"434-443","source":"Wiley Online Library","title":"The trouble with stress: A flexible method for the evaluation of nonmetric multidimensional scaling","title-short":"The trouble with stress","volume":"16","author":[{"family":"Dexter","given":"Eric"},{"family":"Rollwagen-Bollens","given":"Gretchen"},{"family":"Bollens","given":"Stephen M."}],"issued":{"date-parts":[["2018"]]}}}],"schema":"https://github.com/citation-style-language/schema/raw/master/csl-citation.json"} </w:instrText>
+      </w:r>
+      <w:r>
+        <w:rPr>
+          <w:b/>
+          <w:bCs/>
+        </w:rPr>
+        <w:fldChar w:fldCharType="separate"/>
+      </w:r>
+      <w:r>
+        <w:t>(2018)</w:t>
+      </w:r>
+      <w:r>
+        <w:rPr>
+          <w:b/>
+          <w:bCs/>
+        </w:rPr>
+        <w:fldChar w:fldCharType="end"/>
+      </w:r>
+      <w:r>
+        <w:t xml:space="preserve"> (null mean = 0.282, </w:t>
+      </w:r>
+      <w:r>
+        <w:rPr>
+          <w:i/>
+          <w:iCs/>
+        </w:rPr>
+        <w:t xml:space="preserve">z </w:t>
+      </w:r>
+      <w:r>
+        <w:t xml:space="preserve">= -14.95, </w:t>
+      </w:r>
+      <w:r>
+        <w:rPr>
+          <w:i/>
+          <w:iCs/>
+        </w:rPr>
+        <w:t>p</w:t>
+      </w:r>
+      <w:r>
+        <w:t xml:space="preserve"> &lt; 0.001). Therefore, the NMDS ordination represented structure in the observed dissimilarity matrix better than expected under the null model</w:t>
+      </w:r>
+      <w:r>
+        <w:t>.</w:t>
+      </w:r>
+      <w:r>
+        <w:t xml:space="preserve"> </w:t>
+      </w:r>
+      <w:r>
+        <w:t>Overall, t</w:t>
+      </w:r>
+      <w:r>
+        <w:t>he NMDS ordination indicates that</w:t>
+      </w:r>
+      <w:r>
+        <w:t xml:space="preserve"> assemblages assigned to cluster 6 were more similar in composition to those assigned to cluster 2 than to other clusters (Figure 4). Assemblages assigned to </w:t>
+      </w:r>
+      <w:r>
+        <w:t xml:space="preserve">cluster 1 </w:t>
+      </w:r>
+      <w:r>
+        <w:t>tended to occur</w:t>
+      </w:r>
+      <w:r>
+        <w:t xml:space="preserve"> at intermediate seafloor depths, while cluster 3 occurred at greater seafloor depths and clusters 2</w:t>
+      </w:r>
+      <w:r>
+        <w:t>, 5,</w:t>
+      </w:r>
+      <w:r>
+        <w:t xml:space="preserve"> and 6 occurred at shallower seafloor depths</w:t>
+      </w:r>
+      <w:r>
+        <w:t xml:space="preserve"> (Figure 4)</w:t>
+      </w:r>
+      <w:r>
+        <w:t xml:space="preserve">. </w:t>
+      </w:r>
+      <w:r>
+        <w:t>Similarly</w:t>
+      </w:r>
+      <w:r>
+        <w:t xml:space="preserve">, </w:t>
+      </w:r>
+      <w:r>
+        <w:t>assemblages assigned to clusters 3 and 5 tended to occur at the greatest net tow depths</w:t>
+      </w:r>
+      <w:r>
+        <w:t xml:space="preserve"> (Figure 4)</w:t>
+      </w:r>
+      <w:r>
+        <w:t>.</w:t>
+      </w:r>
+      <w:r>
+        <w:t xml:space="preserve"> </w:t>
+      </w:r>
+      <w:r>
+        <w:t>Assemblages assigned to cluster 5 tended to occur during the daytime</w:t>
+      </w:r>
+      <w:r>
+        <w:t xml:space="preserve"> (Figure 4)</w:t>
+      </w:r>
+      <w:r>
+        <w:t>. Cluster 6 tended to occur at high latitudes, while clusters 3 and 5 tended to occur at lower latitudes</w:t>
+      </w:r>
+      <w:r>
+        <w:t xml:space="preserve"> (Figure 4)</w:t>
+      </w:r>
+      <w:r>
+        <w:t>.</w:t>
+      </w:r>
     </w:p>
     <w:p>
       <w:pPr>
@@ -4532,7 +4183,10 @@
       </w:pPr>
       <w:r>
         <w:lastRenderedPageBreak/>
-        <w:t>2.2</w:t>
+        <w:t>3</w:t>
+      </w:r>
+      <w:r>
+        <w:t>.2</w:t>
       </w:r>
       <w:r>
         <w:tab/>
@@ -4791,8 +4445,8 @@
         </w:rPr>
         <w:t xml:space="preserve"> indicated that about </w:t>
       </w:r>
-      <w:commentRangeStart w:id="40"/>
-      <w:commentRangeStart w:id="41"/>
+      <w:commentRangeStart w:id="24"/>
+      <w:commentRangeStart w:id="25"/>
       <w:r>
         <w:rPr>
           <w:rFonts w:eastAsiaTheme="minorHAnsi"/>
@@ -4901,7 +4555,7 @@
         </w:rPr>
         <w:t>alone, and 1.57%</w:t>
       </w:r>
-      <w:commentRangeEnd w:id="40"/>
+      <w:commentRangeEnd w:id="24"/>
       <w:r>
         <w:rPr>
           <w:rStyle w:val="CommentReference"/>
@@ -4912,9 +4566,9 @@
           <w:sz w:val="24"/>
           <w:szCs w:val="24"/>
         </w:rPr>
-        <w:commentReference w:id="40"/>
-      </w:r>
-      <w:commentRangeEnd w:id="41"/>
+        <w:commentReference w:id="24"/>
+      </w:r>
+      <w:commentRangeEnd w:id="25"/>
       <w:r>
         <w:rPr>
           <w:rStyle w:val="CommentReference"/>
@@ -4925,7 +4579,7 @@
           <w:sz w:val="24"/>
           <w:szCs w:val="24"/>
         </w:rPr>
-        <w:commentReference w:id="41"/>
+        <w:commentReference w:id="25"/>
       </w:r>
       <w:r>
         <w:rPr>
@@ -5517,7 +5171,7 @@
         </w:rPr>
         <w:t xml:space="preserve"> </w:t>
       </w:r>
-      <w:ins w:id="42" w:author="Bobay, Luke Andrew" w:date="2026-09-09T15:28:00Z" w16du:dateUtc="2026-09-09T22:28:00Z">
+      <w:ins w:id="26" w:author="Bobay, Luke Andrew" w:date="2026-09-09T15:28:00Z" w16du:dateUtc="2026-09-09T22:28:00Z">
         <w:r>
           <w:rPr>
             <w:rFonts w:eastAsiaTheme="minorHAnsi"/>
@@ -5528,7 +5182,7 @@
           <w:t>&lt;</w:t>
         </w:r>
       </w:ins>
-      <w:del w:id="43" w:author="Bobay, Luke Andrew" w:date="2026-09-09T15:28:00Z" w16du:dateUtc="2026-09-09T22:28:00Z">
+      <w:del w:id="27" w:author="Bobay, Luke Andrew" w:date="2026-09-09T15:28:00Z" w16du:dateUtc="2026-09-09T22:28:00Z">
         <w:r>
           <w:rPr>
             <w:rFonts w:eastAsiaTheme="minorHAnsi"/>
@@ -5925,7 +5579,7 @@
         </w:rPr>
         <w:t xml:space="preserve"> (Figure 5)</w:t>
       </w:r>
-      <w:commentRangeStart w:id="44"/>
+      <w:commentRangeStart w:id="28"/>
       <w:r>
         <w:rPr>
           <w:rFonts w:eastAsiaTheme="minorHAnsi"/>
@@ -5935,7 +5589,7 @@
         </w:rPr>
         <w:t>.</w:t>
       </w:r>
-      <w:commentRangeEnd w:id="44"/>
+      <w:commentRangeEnd w:id="28"/>
       <w:r>
         <w:rPr>
           <w:rStyle w:val="CommentReference"/>
@@ -5946,7 +5600,7 @@
           <w:sz w:val="24"/>
           <w:szCs w:val="24"/>
         </w:rPr>
-        <w:commentReference w:id="44"/>
+        <w:commentReference w:id="28"/>
       </w:r>
       <w:r>
         <w:rPr>
@@ -5992,7 +5646,10 @@
         <w:pStyle w:val="Heading2"/>
       </w:pPr>
       <w:r>
-        <w:t>2.3</w:t>
+        <w:t>3</w:t>
+      </w:r>
+      <w:r>
+        <w:t>.3</w:t>
       </w:r>
       <w:r>
         <w:tab/>
@@ -6004,7 +5661,7 @@
     <w:p>
       <w:pPr>
         <w:rPr>
-          <w:del w:id="45" w:author="Bobay, Luke Andrew" w:date="2026-08-28T18:22:00Z" w16du:dateUtc="2026-08-29T01:22:00Z"/>
+          <w:del w:id="29" w:author="Bobay, Luke Andrew" w:date="2026-08-28T18:22:00Z" w16du:dateUtc="2026-08-29T01:22:00Z"/>
         </w:rPr>
       </w:pPr>
       <w:r>
@@ -6266,16 +5923,9 @@
       <w:r>
         <w:t>) (Fig</w:t>
       </w:r>
-      <w:ins w:id="46" w:author="Bobay, Luke Andrew" w:date="2026-09-09T15:30:00Z" w16du:dateUtc="2026-09-09T22:30:00Z">
-        <w:r>
-          <w:t>ure</w:t>
-        </w:r>
-      </w:ins>
-      <w:del w:id="47" w:author="Bobay, Luke Andrew" w:date="2026-09-09T15:30:00Z" w16du:dateUtc="2026-09-09T22:30:00Z">
-        <w:r>
-          <w:delText>.</w:delText>
-        </w:r>
-      </w:del>
+      <w:r>
+        <w:t>ure</w:t>
+      </w:r>
       <w:r>
         <w:t xml:space="preserve"> 6). </w:t>
       </w:r>
@@ -6291,16 +5941,9 @@
       <w:r>
         <w:t xml:space="preserve"> varie</w:t>
       </w:r>
-      <w:ins w:id="48" w:author="Bobay, Luke Andrew" w:date="2026-09-09T15:31:00Z" w16du:dateUtc="2026-09-09T22:31:00Z">
-        <w:r>
-          <w:t>d</w:t>
-        </w:r>
-      </w:ins>
-      <w:del w:id="49" w:author="Bobay, Luke Andrew" w:date="2026-09-09T15:31:00Z" w16du:dateUtc="2026-09-09T22:31:00Z">
-        <w:r>
-          <w:delText>s</w:delText>
-        </w:r>
-      </w:del>
+      <w:r>
+        <w:t>d</w:t>
+      </w:r>
       <w:r>
         <w:t xml:space="preserve"> </w:t>
       </w:r>
@@ -6331,7 +5974,21 @@
           <w:i/>
           <w:iCs/>
         </w:rPr>
-        <w:t>Bathylagus ochotensis</w:t>
+        <w:t>B</w:t>
+      </w:r>
+      <w:r>
+        <w:rPr>
+          <w:i/>
+          <w:iCs/>
+        </w:rPr>
+        <w:t>.</w:t>
+      </w:r>
+      <w:r>
+        <w:rPr>
+          <w:i/>
+          <w:iCs/>
+        </w:rPr>
+        <w:t xml:space="preserve"> ochotensis</w:t>
       </w:r>
       <w:r>
         <w:t xml:space="preserve"> and </w:t>
@@ -6348,18 +6005,14 @@
           <w:i/>
           <w:iCs/>
         </w:rPr>
-        <w:t xml:space="preserve"> </w:t>
-      </w:r>
-      <w:r>
-        <w:rPr>
-          <w:i/>
-          <w:iCs/>
-        </w:rPr>
+        <w:t xml:space="preserve"> leucopsarus</w:t>
+      </w:r>
+      <w:r>
+        <w:t xml:space="preserve">) but not others </w:t>
+      </w:r>
+      <w:r>
         <w:lastRenderedPageBreak/>
-        <w:t>leucopsarus</w:t>
-      </w:r>
-      <w:r>
-        <w:t>) but not others (</w:t>
+        <w:t>(</w:t>
       </w:r>
       <w:r>
         <w:rPr>
@@ -6579,7 +6232,7 @@
       </w:r>
     </w:p>
   </w:comment>
-  <w:comment w:id="18" w:author="Bobay, Luke Andrew" w:date="2026-09-09T14:46:00Z" w:initials="LB">
+  <w:comment w:id="9" w:author="Bobay, Luke Andrew" w:date="2026-09-09T14:46:00Z" w:initials="LB">
     <w:p>
       <w:pPr>
         <w:pStyle w:val="CommentText"/>
@@ -6595,7 +6248,7 @@
       </w:r>
     </w:p>
   </w:comment>
-  <w:comment w:id="28" w:author="Bobay, Luke Andrew" w:date="2026-09-09T09:16:00Z" w:initials="LB">
+  <w:comment w:id="12" w:author="Bobay, Luke Andrew" w:date="2026-09-09T09:16:00Z" w:initials="LB">
     <w:p>
       <w:pPr>
         <w:pStyle w:val="CommentText"/>
@@ -6615,7 +6268,7 @@
       </w:r>
     </w:p>
   </w:comment>
-  <w:comment w:id="34" w:author="McCloskey, Ross" w:date="2026-09-07T12:07:00Z" w:initials="RM">
+  <w:comment w:id="18" w:author="McCloskey, Ross" w:date="2026-09-07T12:07:00Z" w:initials="RM">
     <w:p>
       <w:pPr>
         <w:pStyle w:val="CommentText"/>
@@ -6631,7 +6284,7 @@
       </w:r>
     </w:p>
   </w:comment>
-  <w:comment w:id="35" w:author="McCloskey, Ross" w:date="2026-09-07T12:10:00Z" w:initials="RM">
+  <w:comment w:id="19" w:author="McCloskey, Ross" w:date="2026-09-07T12:10:00Z" w:initials="RM">
     <w:p>
       <w:pPr>
         <w:pStyle w:val="CommentText"/>
@@ -6647,7 +6300,7 @@
       </w:r>
     </w:p>
   </w:comment>
-  <w:comment w:id="36" w:author="Bobay, Luke Andrew" w:date="2026-09-09T12:16:00Z" w:initials="LB">
+  <w:comment w:id="20" w:author="Bobay, Luke Andrew" w:date="2026-09-09T12:16:00Z" w:initials="LB">
     <w:p>
       <w:pPr>
         <w:pStyle w:val="CommentText"/>
@@ -6663,7 +6316,7 @@
       </w:r>
     </w:p>
   </w:comment>
-  <w:comment w:id="40" w:author="McCloskey, Ross" w:date="2026-09-07T12:33:00Z" w:initials="RM">
+  <w:comment w:id="24" w:author="McCloskey, Ross" w:date="2026-09-07T12:33:00Z" w:initials="RM">
     <w:p>
       <w:pPr>
         <w:pStyle w:val="CommentText"/>
@@ -6679,7 +6332,7 @@
       </w:r>
     </w:p>
   </w:comment>
-  <w:comment w:id="41" w:author="Bobay, Luke Andrew" w:date="2026-09-09T15:01:00Z" w:initials="LB">
+  <w:comment w:id="25" w:author="Bobay, Luke Andrew" w:date="2026-09-09T15:01:00Z" w:initials="LB">
     <w:p>
       <w:pPr>
         <w:pStyle w:val="CommentText"/>
@@ -6695,7 +6348,7 @@
       </w:r>
     </w:p>
   </w:comment>
-  <w:comment w:id="44" w:author="McCloskey, Ross" w:date="2026-09-07T13:29:00Z" w:initials="RM">
+  <w:comment w:id="28" w:author="McCloskey, Ross" w:date="2026-09-07T13:29:00Z" w:initials="RM">
     <w:p>
       <w:pPr>
         <w:pStyle w:val="CommentText"/>
@@ -7282,21 +6935,15 @@
     <w:next w:val="Normal"/>
     <w:link w:val="Heading3Char"/>
     <w:uiPriority w:val="9"/>
-    <w:semiHidden/>
     <w:unhideWhenUsed/>
     <w:qFormat/>
-    <w:rsid w:val="007B44F8"/>
+    <w:rsid w:val="005D5995"/>
     <w:pPr>
-      <w:keepNext/>
-      <w:keepLines/>
-      <w:spacing w:before="160" w:after="80"/>
       <w:outlineLvl w:val="2"/>
     </w:pPr>
     <w:rPr>
-      <w:rFonts w:eastAsiaTheme="majorEastAsia" w:cstheme="majorBidi"/>
-      <w:color w:val="0F4761" w:themeColor="accent1" w:themeShade="BF"/>
-      <w:sz w:val="28"/>
-      <w:szCs w:val="28"/>
+      <w:b/>
+      <w:bCs/>
     </w:rPr>
   </w:style>
   <w:style w:type="paragraph" w:styleId="Heading4">
@@ -7488,13 +7135,11 @@
     <w:basedOn w:val="DefaultParagraphFont"/>
     <w:link w:val="Heading3"/>
     <w:uiPriority w:val="9"/>
-    <w:semiHidden/>
-    <w:rsid w:val="007B44F8"/>
+    <w:rsid w:val="005D5995"/>
     <w:rPr>
-      <w:rFonts w:eastAsiaTheme="majorEastAsia" w:cstheme="majorBidi"/>
-      <w:color w:val="0F4761" w:themeColor="accent1" w:themeShade="BF"/>
-      <w:sz w:val="28"/>
-      <w:szCs w:val="28"/>
+      <w:rFonts w:ascii="Times New Roman" w:hAnsi="Times New Roman" w:cs="Times New Roman"/>
+      <w:b/>
+      <w:bCs/>
     </w:rPr>
   </w:style>
   <w:style w:type="character" w:customStyle="1" w:styleId="Heading4Char">

</xml_diff>

<commit_message>
Accept Word-suggested grammar correction
</commit_message>
<xml_diff>
--- a/Manuscript draft.docx
+++ b/Manuscript draft.docx
@@ -441,15 +441,13 @@
         <w:t xml:space="preserve">, </w:t>
       </w:r>
       <w:r>
-        <w:t>less attention has been paid to fine-scale spatiotemporal and environmental factors that may</w:t>
-      </w:r>
-      <w:del w:id="4" w:author="McCloskey, Ross" w:date="2026-09-23T15:28:00Z" w16du:dateUtc="2026-09-23T22:28:00Z">
-        <w:r>
-          <w:delText xml:space="preserve"> </w:delText>
-        </w:r>
-      </w:del>
-      <w:r>
-        <w:t xml:space="preserve">influence </w:t>
+        <w:t xml:space="preserve">less attention has been paid to fine-scale spatiotemporal and environmental factors that </w:t>
+      </w:r>
+      <w:r>
+        <w:t>may influence</w:t>
+      </w:r>
+      <w:r>
+        <w:t xml:space="preserve"> </w:t>
       </w:r>
       <w:r>
         <w:t>ichthyoplankton assemblage composition and abundance</w:t>
@@ -859,28 +857,28 @@
       <w:r>
         <w:t xml:space="preserve"> is unknown</w:t>
       </w:r>
+      <w:commentRangeStart w:id="4"/>
       <w:commentRangeStart w:id="5"/>
-      <w:commentRangeStart w:id="6"/>
       <w:r>
         <w:t>.</w:t>
       </w:r>
-      <w:commentRangeEnd w:id="5"/>
+      <w:commentRangeEnd w:id="4"/>
       <w:r>
         <w:rPr>
           <w:rStyle w:val="CommentReference"/>
           <w:sz w:val="24"/>
           <w:szCs w:val="24"/>
         </w:rPr>
-        <w:commentReference w:id="5"/>
-      </w:r>
-      <w:commentRangeEnd w:id="6"/>
+        <w:commentReference w:id="4"/>
+      </w:r>
+      <w:commentRangeEnd w:id="5"/>
       <w:r>
         <w:rPr>
           <w:rStyle w:val="CommentReference"/>
           <w:sz w:val="24"/>
           <w:szCs w:val="24"/>
         </w:rPr>
-        <w:commentReference w:id="6"/>
+        <w:commentReference w:id="5"/>
       </w:r>
     </w:p>
     <w:p>
@@ -1147,7 +1145,7 @@
       <w:r>
         <w:t>. Upon retrieval of the MOCNESS, bulk plankton samples were preserved in 95% ethanol. All ichthyoplankton were then visually identified to the finest possible taxonomic resolution (usually genus- or species-level) and counted.</w:t>
       </w:r>
-      <w:ins w:id="7" w:author="Bobay, Luke Andrew" w:date="2026-09-09T08:49:00Z" w16du:dateUtc="2026-09-09T15:49:00Z">
+      <w:ins w:id="6" w:author="Bobay, Luke Andrew" w:date="2026-09-09T08:49:00Z" w16du:dateUtc="2026-09-09T15:49:00Z">
         <w:r>
           <w:t xml:space="preserve"> </w:t>
         </w:r>
@@ -1365,7 +1363,7 @@
     <w:p>
       <w:pPr>
         <w:rPr>
-          <w:del w:id="8" w:author="Bobay, Luke Andrew" w:date="2026-09-09T09:01:00Z" w16du:dateUtc="2026-09-09T16:01:00Z"/>
+          <w:del w:id="7" w:author="Bobay, Luke Andrew" w:date="2026-09-09T09:01:00Z" w16du:dateUtc="2026-09-09T16:01:00Z"/>
         </w:rPr>
       </w:pPr>
       <w:r>
@@ -1617,18 +1615,18 @@
       <w:r>
         <w:t>(</w:t>
       </w:r>
-      <w:commentRangeStart w:id="9"/>
+      <w:commentRangeStart w:id="8"/>
       <w:r>
         <w:t>NMDS</w:t>
       </w:r>
-      <w:commentRangeEnd w:id="9"/>
+      <w:commentRangeEnd w:id="8"/>
       <w:r>
         <w:rPr>
           <w:rStyle w:val="CommentReference"/>
           <w:sz w:val="24"/>
           <w:szCs w:val="24"/>
         </w:rPr>
-        <w:commentReference w:id="9"/>
+        <w:commentReference w:id="8"/>
       </w:r>
       <w:r>
         <w:t>)</w:t>
@@ -1790,7 +1788,7 @@
       <w:r>
         <w:t>.</w:t>
       </w:r>
-      <w:del w:id="10" w:author="Bobay, Luke Andrew" w:date="2026-09-09T14:06:00Z" w16du:dateUtc="2026-09-09T21:06:00Z">
+      <w:del w:id="9" w:author="Bobay, Luke Andrew" w:date="2026-09-09T14:06:00Z" w16du:dateUtc="2026-09-09T21:06:00Z">
         <w:r>
           <w:delText xml:space="preserve"> </w:delText>
         </w:r>
@@ -3268,7 +3266,7 @@
       <w:r>
         <w:t>each sample.</w:t>
       </w:r>
-      <w:ins w:id="11" w:author="Bobay, Luke Andrew" w:date="2026-08-29T00:39:00Z" w16du:dateUtc="2026-08-29T07:39:00Z">
+      <w:ins w:id="10" w:author="Bobay, Luke Andrew" w:date="2026-08-29T00:39:00Z" w16du:dateUtc="2026-08-29T07:39:00Z">
         <w:r>
           <w:t xml:space="preserve"> </w:t>
         </w:r>
@@ -3349,7 +3347,7 @@
       <w:r>
         <w:t>All statistical analyses were conducted using R version 4.5.2 (</w:t>
       </w:r>
-      <w:commentRangeStart w:id="12"/>
+      <w:commentRangeStart w:id="11"/>
       <w:r>
         <w:t>R Core Team</w:t>
       </w:r>
@@ -3359,14 +3357,14 @@
       <w:r>
         <w:t xml:space="preserve"> 2025</w:t>
       </w:r>
-      <w:commentRangeEnd w:id="12"/>
+      <w:commentRangeEnd w:id="11"/>
       <w:r>
         <w:rPr>
           <w:rStyle w:val="CommentReference"/>
           <w:sz w:val="24"/>
           <w:szCs w:val="24"/>
         </w:rPr>
-        <w:commentReference w:id="12"/>
+        <w:commentReference w:id="11"/>
       </w:r>
       <w:r>
         <w:t xml:space="preserve">). </w:t>
@@ -3478,7 +3476,7 @@
       <w:r>
         <w:t>thresholding</w:t>
       </w:r>
-      <w:ins w:id="13" w:author="Bobay, Luke Andrew" w:date="2026-09-09T11:10:00Z" w16du:dateUtc="2026-09-09T18:10:00Z">
+      <w:ins w:id="12" w:author="Bobay, Luke Andrew" w:date="2026-09-09T11:10:00Z" w16du:dateUtc="2026-09-09T18:10:00Z">
         <w:r>
           <w:t>,</w:t>
         </w:r>
@@ -3642,6 +3640,14 @@
     <w:p>
       <w:r>
         <w:t>Cluster analysis of net tows yielded seven total clusters, two of which</w:t>
+      </w:r>
+      <w:ins w:id="13" w:author="Bobay, Luke Andrew" w:date="2026-09-09T11:55:00Z" w16du:dateUtc="2026-09-09T18:55:00Z">
+        <w:r>
+          <w:t xml:space="preserve"> </w:t>
+        </w:r>
+      </w:ins>
+      <w:r>
+        <w:t>—</w:t>
       </w:r>
       <w:ins w:id="14" w:author="Bobay, Luke Andrew" w:date="2026-09-09T11:55:00Z" w16du:dateUtc="2026-09-09T18:55:00Z">
         <w:r>
@@ -3649,7 +3655,7 @@
         </w:r>
       </w:ins>
       <w:r>
-        <w:t>—</w:t>
+        <w:t>clusters 4 and 7</w:t>
       </w:r>
       <w:ins w:id="15" w:author="Bobay, Luke Andrew" w:date="2026-09-09T11:55:00Z" w16du:dateUtc="2026-09-09T18:55:00Z">
         <w:r>
@@ -3657,7 +3663,7 @@
         </w:r>
       </w:ins>
       <w:r>
-        <w:t>clusters 4 and 7</w:t>
+        <w:t>—</w:t>
       </w:r>
       <w:ins w:id="16" w:author="Bobay, Luke Andrew" w:date="2026-09-09T11:55:00Z" w16du:dateUtc="2026-09-09T18:55:00Z">
         <w:r>
@@ -3665,14 +3671,6 @@
         </w:r>
       </w:ins>
       <w:r>
-        <w:t>—</w:t>
-      </w:r>
-      <w:ins w:id="17" w:author="Bobay, Luke Andrew" w:date="2026-09-09T11:55:00Z" w16du:dateUtc="2026-09-09T18:55:00Z">
-        <w:r>
-          <w:t xml:space="preserve"> </w:t>
-        </w:r>
-      </w:ins>
-      <w:r>
         <w:t>contained only a single sampl</w:t>
       </w:r>
       <w:r>
@@ -3766,9 +3764,9 @@
       <w:r>
         <w:t xml:space="preserve"> the indicator species </w:t>
       </w:r>
+      <w:commentRangeStart w:id="17"/>
       <w:commentRangeStart w:id="18"/>
       <w:commentRangeStart w:id="19"/>
-      <w:commentRangeStart w:id="20"/>
       <w:r>
         <w:rPr>
           <w:i/>
@@ -3796,32 +3794,32 @@
       <w:r>
         <w:t xml:space="preserve"> </w:t>
       </w:r>
-      <w:commentRangeEnd w:id="18"/>
+      <w:commentRangeEnd w:id="17"/>
       <w:r>
         <w:rPr>
           <w:rStyle w:val="CommentReference"/>
           <w:sz w:val="24"/>
           <w:szCs w:val="24"/>
         </w:rPr>
-        <w:commentReference w:id="18"/>
-      </w:r>
-      <w:commentRangeEnd w:id="19"/>
+        <w:commentReference w:id="17"/>
+      </w:r>
+      <w:commentRangeEnd w:id="18"/>
       <w:r>
         <w:rPr>
           <w:rStyle w:val="CommentReference"/>
           <w:sz w:val="24"/>
           <w:szCs w:val="24"/>
         </w:rPr>
-        <w:commentReference w:id="19"/>
-      </w:r>
-      <w:commentRangeEnd w:id="20"/>
+        <w:commentReference w:id="18"/>
+      </w:r>
+      <w:commentRangeEnd w:id="19"/>
       <w:r>
         <w:rPr>
           <w:rStyle w:val="CommentReference"/>
           <w:sz w:val="24"/>
           <w:szCs w:val="24"/>
         </w:rPr>
-        <w:commentReference w:id="20"/>
+        <w:commentReference w:id="19"/>
       </w:r>
       <w:r>
         <w:t>(</w:t>
@@ -3900,7 +3898,7 @@
       <w:r>
         <w:t xml:space="preserve"> over the shelf break</w:t>
       </w:r>
-      <w:ins w:id="21" w:author="McCloskey, Ross" w:date="2026-09-23T15:55:00Z" w16du:dateUtc="2026-09-23T22:55:00Z">
+      <w:ins w:id="20" w:author="McCloskey, Ross" w:date="2026-09-23T15:55:00Z" w16du:dateUtc="2026-09-23T22:55:00Z">
         <w:r>
           <w:t>,</w:t>
         </w:r>
@@ -3938,7 +3936,7 @@
       <w:r>
         <w:t xml:space="preserve"> 2022</w:t>
       </w:r>
-      <w:ins w:id="22" w:author="Bobay, Luke Andrew" w:date="2026-09-09T12:41:00Z" w16du:dateUtc="2026-09-09T19:41:00Z">
+      <w:ins w:id="21" w:author="Bobay, Luke Andrew" w:date="2026-09-09T12:41:00Z" w16du:dateUtc="2026-09-09T19:41:00Z">
         <w:r>
           <w:t>,</w:t>
         </w:r>
@@ -3990,7 +3988,7 @@
       <w:r>
         <w:t>,</w:t>
       </w:r>
-      <w:del w:id="23" w:author="McCloskey, Ross" w:date="2026-09-23T15:56:00Z" w16du:dateUtc="2026-09-23T22:56:00Z">
+      <w:del w:id="22" w:author="McCloskey, Ross" w:date="2026-09-23T15:56:00Z" w16du:dateUtc="2026-09-23T22:56:00Z">
         <w:r>
           <w:delText xml:space="preserve"> </w:delText>
         </w:r>
@@ -4445,8 +4443,8 @@
         </w:rPr>
         <w:t xml:space="preserve"> indicated that about </w:t>
       </w:r>
+      <w:commentRangeStart w:id="23"/>
       <w:commentRangeStart w:id="24"/>
-      <w:commentRangeStart w:id="25"/>
       <w:r>
         <w:rPr>
           <w:rFonts w:eastAsiaTheme="minorHAnsi"/>
@@ -4555,7 +4553,7 @@
         </w:rPr>
         <w:t>alone, and 1.57%</w:t>
       </w:r>
-      <w:commentRangeEnd w:id="24"/>
+      <w:commentRangeEnd w:id="23"/>
       <w:r>
         <w:rPr>
           <w:rStyle w:val="CommentReference"/>
@@ -4566,9 +4564,9 @@
           <w:sz w:val="24"/>
           <w:szCs w:val="24"/>
         </w:rPr>
-        <w:commentReference w:id="24"/>
-      </w:r>
-      <w:commentRangeEnd w:id="25"/>
+        <w:commentReference w:id="23"/>
+      </w:r>
+      <w:commentRangeEnd w:id="24"/>
       <w:r>
         <w:rPr>
           <w:rStyle w:val="CommentReference"/>
@@ -4579,7 +4577,7 @@
           <w:sz w:val="24"/>
           <w:szCs w:val="24"/>
         </w:rPr>
-        <w:commentReference w:id="25"/>
+        <w:commentReference w:id="24"/>
       </w:r>
       <w:r>
         <w:rPr>
@@ -5171,7 +5169,7 @@
         </w:rPr>
         <w:t xml:space="preserve"> </w:t>
       </w:r>
-      <w:ins w:id="26" w:author="Bobay, Luke Andrew" w:date="2026-09-09T15:28:00Z" w16du:dateUtc="2026-09-09T22:28:00Z">
+      <w:ins w:id="25" w:author="Bobay, Luke Andrew" w:date="2026-09-09T15:28:00Z" w16du:dateUtc="2026-09-09T22:28:00Z">
         <w:r>
           <w:rPr>
             <w:rFonts w:eastAsiaTheme="minorHAnsi"/>
@@ -5182,7 +5180,7 @@
           <w:t>&lt;</w:t>
         </w:r>
       </w:ins>
-      <w:del w:id="27" w:author="Bobay, Luke Andrew" w:date="2026-09-09T15:28:00Z" w16du:dateUtc="2026-09-09T22:28:00Z">
+      <w:del w:id="26" w:author="Bobay, Luke Andrew" w:date="2026-09-09T15:28:00Z" w16du:dateUtc="2026-09-09T22:28:00Z">
         <w:r>
           <w:rPr>
             <w:rFonts w:eastAsiaTheme="minorHAnsi"/>
@@ -5579,7 +5577,7 @@
         </w:rPr>
         <w:t xml:space="preserve"> (Figure 5)</w:t>
       </w:r>
-      <w:commentRangeStart w:id="28"/>
+      <w:commentRangeStart w:id="27"/>
       <w:r>
         <w:rPr>
           <w:rFonts w:eastAsiaTheme="minorHAnsi"/>
@@ -5589,7 +5587,7 @@
         </w:rPr>
         <w:t>.</w:t>
       </w:r>
-      <w:commentRangeEnd w:id="28"/>
+      <w:commentRangeEnd w:id="27"/>
       <w:r>
         <w:rPr>
           <w:rStyle w:val="CommentReference"/>
@@ -5600,7 +5598,7 @@
           <w:sz w:val="24"/>
           <w:szCs w:val="24"/>
         </w:rPr>
-        <w:commentReference w:id="28"/>
+        <w:commentReference w:id="27"/>
       </w:r>
       <w:r>
         <w:rPr>
@@ -5661,7 +5659,7 @@
     <w:p>
       <w:pPr>
         <w:rPr>
-          <w:del w:id="29" w:author="Bobay, Luke Andrew" w:date="2026-08-28T18:22:00Z" w16du:dateUtc="2026-08-29T01:22:00Z"/>
+          <w:del w:id="28" w:author="Bobay, Luke Andrew" w:date="2026-08-28T18:22:00Z" w16du:dateUtc="2026-08-29T01:22:00Z"/>
         </w:rPr>
       </w:pPr>
       <w:r>
@@ -6192,7 +6190,7 @@
       </w:r>
     </w:p>
   </w:comment>
-  <w:comment w:id="5" w:author="McCloskey, Ross" w:date="2026-08-18T15:29:00Z" w:initials="RM">
+  <w:comment w:id="4" w:author="McCloskey, Ross" w:date="2026-08-18T15:29:00Z" w:initials="RM">
     <w:p>
       <w:pPr>
         <w:pStyle w:val="CommentText"/>
@@ -6216,7 +6214,7 @@
       </w:r>
     </w:p>
   </w:comment>
-  <w:comment w:id="6" w:author="Bobay, Luke Andrew" w:date="2026-08-28T14:16:00Z" w:initials="LB">
+  <w:comment w:id="5" w:author="Bobay, Luke Andrew" w:date="2026-08-28T14:16:00Z" w:initials="LB">
     <w:p>
       <w:pPr>
         <w:pStyle w:val="CommentText"/>
@@ -6232,7 +6230,7 @@
       </w:r>
     </w:p>
   </w:comment>
-  <w:comment w:id="9" w:author="Bobay, Luke Andrew" w:date="2026-09-09T14:46:00Z" w:initials="LB">
+  <w:comment w:id="8" w:author="Bobay, Luke Andrew" w:date="2026-09-09T14:46:00Z" w:initials="LB">
     <w:p>
       <w:pPr>
         <w:pStyle w:val="CommentText"/>
@@ -6248,7 +6246,7 @@
       </w:r>
     </w:p>
   </w:comment>
-  <w:comment w:id="12" w:author="Bobay, Luke Andrew" w:date="2026-09-09T09:16:00Z" w:initials="LB">
+  <w:comment w:id="11" w:author="Bobay, Luke Andrew" w:date="2026-09-09T09:16:00Z" w:initials="LB">
     <w:p>
       <w:pPr>
         <w:pStyle w:val="CommentText"/>
@@ -6268,7 +6266,7 @@
       </w:r>
     </w:p>
   </w:comment>
-  <w:comment w:id="18" w:author="McCloskey, Ross" w:date="2026-09-07T12:07:00Z" w:initials="RM">
+  <w:comment w:id="17" w:author="McCloskey, Ross" w:date="2026-09-07T12:07:00Z" w:initials="RM">
     <w:p>
       <w:pPr>
         <w:pStyle w:val="CommentText"/>
@@ -6284,7 +6282,7 @@
       </w:r>
     </w:p>
   </w:comment>
-  <w:comment w:id="19" w:author="McCloskey, Ross" w:date="2026-09-07T12:10:00Z" w:initials="RM">
+  <w:comment w:id="18" w:author="McCloskey, Ross" w:date="2026-09-07T12:10:00Z" w:initials="RM">
     <w:p>
       <w:pPr>
         <w:pStyle w:val="CommentText"/>
@@ -6300,7 +6298,7 @@
       </w:r>
     </w:p>
   </w:comment>
-  <w:comment w:id="20" w:author="Bobay, Luke Andrew" w:date="2026-09-09T12:16:00Z" w:initials="LB">
+  <w:comment w:id="19" w:author="Bobay, Luke Andrew" w:date="2026-09-09T12:16:00Z" w:initials="LB">
     <w:p>
       <w:pPr>
         <w:pStyle w:val="CommentText"/>
@@ -6316,7 +6314,7 @@
       </w:r>
     </w:p>
   </w:comment>
-  <w:comment w:id="24" w:author="McCloskey, Ross" w:date="2026-09-07T12:33:00Z" w:initials="RM">
+  <w:comment w:id="23" w:author="McCloskey, Ross" w:date="2026-09-07T12:33:00Z" w:initials="RM">
     <w:p>
       <w:pPr>
         <w:pStyle w:val="CommentText"/>
@@ -6332,7 +6330,7 @@
       </w:r>
     </w:p>
   </w:comment>
-  <w:comment w:id="25" w:author="Bobay, Luke Andrew" w:date="2026-09-09T15:01:00Z" w:initials="LB">
+  <w:comment w:id="24" w:author="Bobay, Luke Andrew" w:date="2026-09-09T15:01:00Z" w:initials="LB">
     <w:p>
       <w:pPr>
         <w:pStyle w:val="CommentText"/>
@@ -6348,7 +6346,7 @@
       </w:r>
     </w:p>
   </w:comment>
-  <w:comment w:id="28" w:author="McCloskey, Ross" w:date="2026-09-07T13:29:00Z" w:initials="RM">
+  <w:comment w:id="27" w:author="McCloskey, Ross" w:date="2026-09-07T13:29:00Z" w:initials="RM">
     <w:p>
       <w:pPr>
         <w:pStyle w:val="CommentText"/>

</xml_diff>